<commit_message>
Add physical AI execution-layer proposal to report v2 (section 4.5)
- reduction.py: execution-layer requirement spec from the demand-cap
  simulation (action frequency, size, queued deferral, lead time,
  timing groups), dev weekday load profile, architecture figure
- report v2: new 4.5 (layer mapping to Liu et al. 2026, requirement
  spec, LLM role and limits, staged rollout, data needed), disclosure
  of how the demand-cap rule was revised after test results, linked
  edits in summary, contributions, conclusion and references
- PROGRESS/DECISIONS: record the proposal scope and evidence

Co-Authored-By: Claude Opus 5.5 <noreply@anthropic.com>
Claude-Session: https://claude.ai/code/session_01VoNtEi76coFkX6N7GcB6my
</commit_message>
<xml_diff>
--- a/submission/report/report_draft_v2.docx
+++ b/submission/report/report_draft_v2.docx
@@ -767,6 +767,35 @@
           <w:szCs w:val="28"/>
         </w:rPr>
         <w:t xml:space="preserve"> 경보가 켜진 시간에만 준비했다. 근무일 하루 평균 7.7시간의 준비로 목표를 넘는 구간을 모두 다뤘다.</w:t>
+      </w:r>
+    </w:p>
+    <w:p>
+      <w:pPr>
+        <w:pStyle w:val="ListParagraph"/>
+        <w:numPr>
+          <w:ilvl w:val="0"/>
+          <w:numId w:val="2"/>
+        </w:numPr>
+        <w:spacing w:after="60" w:line="384"/>
+        <w:jc w:val="both"/>
+      </w:pPr>
+      <w:r>
+        <w:rPr>
+          <w:rFonts w:ascii="휴먼명조" w:cs="휴먼명조" w:eastAsia="휴먼명조" w:hAnsi="휴먼명조"/>
+          <w:b/>
+          <w:bCs/>
+          <w:sz w:val="28"/>
+          <w:szCs w:val="28"/>
+        </w:rPr>
+        <w:t xml:space="preserve">실행 구조:</w:t>
+      </w:r>
+      <w:r>
+        <w:rPr>
+          <w:rFonts w:ascii="휴먼명조" w:cs="휴먼명조" w:eastAsia="휴먼명조" w:hAnsi="휴먼명조"/>
+          <w:sz w:val="28"/>
+          <w:szCs w:val="28"/>
+        </w:rPr>
+        <w:t xml:space="preserve"> 이 조치를 설비가 스스로 실행하도록 지각–분석–의사결정–실행의 피지컬 AI 구조를 제안했다. 지각·분석 계층은 구현·평가했고, 의사결정·실행 계층의 요구 사양은 모의 결과로 정했다.</w:t>
       </w:r>
     </w:p>
     <w:p>
@@ -1281,7 +1310,7 @@
                 <w:sz w:val="20"/>
                 <w:szCs w:val="20"/>
               </w:rPr>
-              <w:t xml:space="preserve">목표 최대수요 운영, 설비 기동 시점 분산, 경보 시간 생산량 이동의 세 가지 방안과 정량 효과</w:t>
+              <w:t xml:space="preserve">목표 최대수요 운영, 설비 기동 시점 분산, 경보 시간 생산량 이동의 세 가지 방안과 정량 효과, 이를 실행하는 피지컬 AI 구조</w:t>
             </w:r>
           </w:p>
         </w:tc>
@@ -1454,7 +1483,7 @@
           <w:sz w:val="28"/>
           <w:szCs w:val="28"/>
         </w:rPr>
-        <w:t xml:space="preserve"> 피크 확률을 비용-손실 판단에 연결하고, 예측 경보로 준비하는 목표 최대수요 운영의 효과와 조치 규모를 정량화했다(4장).</w:t>
+        <w:t xml:space="preserve"> 피크 확률을 비용-손실 판단에 연결하고, 예측 경보로 준비하는 목표 최대수요 운영의 효과와 조치 규모를 정량화했다. 이 조치 규모로 피지컬 AI 실행 계층의 요구 사양을 정했다(4장).</w:t>
       </w:r>
     </w:p>
     <w:p>
@@ -19820,7 +19849,7 @@
           <w:sz w:val="28"/>
           <w:szCs w:val="28"/>
         </w:rPr>
-        <w:t xml:space="preserve"> 개발 구간 평일의 평균 전력은 07:30 구간부터 오르기 시작해 08:30~09:00 구간에 최고치(약 155)에 이른다. 이후 휴식과 점심에 해당하는 10:15, 12:15~13:00, 15:15, 17:15~17:30 구간에서 짧게 내려갔다가, 설비를 다시 켜면서 한꺼번에 오른다. 평가 구간 근무일 26일의 일 최대 구간도 이 흐름을 따랐다. 8일은 아침 기동 직후(08:45~09:00 구간), 8일은 휴식 후 재가동 직후(10:30~10:45, 15:45~16:15 구간), 6일은 휴식·점심 직전(09:45~10:00, 11:45~12:00 구간)에 일 최대가 나타났다.</w:t>
+        <w:t xml:space="preserve"> 개발 구간 평일의 평균 전력은 07:30 구간부터 오르기 시작해 08:30~09:00 구간에 최고치(약 155)에 이른다. 이후 휴식과 점심에 해당하는 10:15, 12:15~13:00, 15:15, 17:15~17:30 구간에서 짧게 내려갔다가, 설비를 다시 켜면서 한꺼번에 오른다. 평가 구간 근무일 26일의 일 최대 구간도 이 흐름을 따랐다. 8일은 아침 기동 직후(08:45~09:00 구간), 8일은 휴식 후 재가동 직후(10:30~11:00, 15:45~16:00 구간), 6일은 휴식·점심 직전(09:45~10:00, 11:45~12:00 구간)에 일 최대가 나타났다.</w:t>
       </w:r>
     </w:p>
     <w:p>
@@ -20308,7 +20337,7 @@
           <w:sz w:val="24"/>
           <w:szCs w:val="24"/>
         </w:rPr>
-        <w:t xml:space="preserve">이 장의 요지. 제안 모델은 평가 구간 근무일의 일 최대 구간을 모두 미리 경보했고, 대부분 3시간 이상 앞섰다. 이 경보로 상한 제어를 준비하는 목표 최대수요 운영은 근무일 하루 7.7시간의 준비만으로 8월 최대수요를 8.3% 낮추었다. 생산량 이동과 기동 시점 분산은 피크 발생 횟수를 줄이는 보조 방안이다.</w:t>
+        <w:t xml:space="preserve">이 장의 요지. 제안 모델은 평가 구간 근무일의 일 최대 구간을 모두 미리 경보했고, 대부분 3시간 이상 앞섰다. 이 경보로 상한 제어를 준비하는 목표 최대수요 운영은 근무일 하루 7.7시간의 준비만으로 8월 최대수요를 8.3% 낮추었다. 생산량 이동과 기동 시점 분산은 피크 발생 횟수를 줄이는 보조 방안이다. 이 조치를 설비가 스스로 실행하는 피지컬 AI 구조를 함께 제안한다.</w:t>
       </w:r>
     </w:p>
     <w:p>
@@ -23733,6 +23762,20 @@
       <w:r>
         <w:rPr>
           <w:rFonts w:ascii="휴먼명조" w:cs="휴먼명조" w:eastAsia="휴먼명조" w:hAnsi="휴먼명조"/>
+          <w:sz w:val="28"/>
+          <w:szCs w:val="28"/>
+        </w:rPr>
+        <w:t xml:space="preserve">이 규칙은 처음에 예측값으로 줄일 양까지 정하는 방식으로 설계했다. 점예측은 짧은 기동 부하를 평탄하게 예측하므로 그 방식의 효과가 작았고, 예측은 준비 시점만 정하고 제어량은 실시간 계측으로 정하는 지금의 구조로 바꾸었다. 이 변경과 목표 D 후보(195~210)는 평가 구간 결과를 본 뒤 정했다. 예측 모델과 경보 기준은 평가 전에 고정한 값 그대로다.</w:t>
+      </w:r>
+    </w:p>
+    <w:p>
+      <w:pPr>
+        <w:spacing w:after="120" w:line="384"/>
+        <w:jc w:val="both"/>
+      </w:pPr>
+      <w:r>
+        <w:rPr>
+          <w:rFonts w:ascii="휴먼명조" w:cs="휴먼명조" w:eastAsia="휴먼명조" w:hAnsi="휴먼명조"/>
           <w:b/>
           <w:bCs/>
           <w:sz w:val="28"/>
@@ -27345,7 +27388,7 @@
                 <w:sz w:val="20"/>
                 <w:szCs w:val="20"/>
               </w:rPr>
-              <w:t xml:space="preserve">4.5절</w:t>
+              <w:t xml:space="preserve">4.6절</w:t>
             </w:r>
           </w:p>
         </w:tc>
@@ -27370,7 +27413,2321 @@
           <w:sz w:val="30"/>
           <w:szCs w:val="30"/>
         </w:rPr>
-        <w:t xml:space="preserve">4.5 현장 적용 지표</w:t>
+        <w:t xml:space="preserve">4.5 실행 구조: 피지컬 AI로의 확장</w:t>
+      </w:r>
+    </w:p>
+    <w:p>
+      <w:pPr>
+        <w:spacing w:after="120" w:line="384"/>
+        <w:jc w:val="both"/>
+      </w:pPr>
+      <w:r>
+        <w:rPr>
+          <w:rFonts w:ascii="휴먼명조" w:cs="휴먼명조" w:eastAsia="휴먼명조" w:hAnsi="휴먼명조"/>
+          <w:sz w:val="28"/>
+          <w:szCs w:val="28"/>
+        </w:rPr>
+        <w:t xml:space="preserve">4.4절의 방안은 무엇을, 언제, 얼마나 조정할지 정한다. 이 절은 그 조정을 설비가 스스로 실행하는 구조를 제안한다. 구조는 LLM 기반 체화된 다중 에이전트 제조 시스템(Liu et al., 2026)의 체화된 지각–분석–의사결정과 설비 에이전트를 피크전력 저감에 맞게 옮긴 것이다. 실행 계층이 감당해야 할 조치의 크기와 빈도는 4.4절의 모의 결과로 정한다. 지각·분석 계층은 이 보고서에서 구현·평가했고, 의사결정·실행 계층은 제안이다.</w:t>
+      </w:r>
+    </w:p>
+    <w:p>
+      <w:pPr>
+        <w:keepNext/>
+        <w:spacing w:after="60" w:before="120"/>
+        <w:jc w:val="center"/>
+      </w:pPr>
+      <w:r>
+        <w:drawing>
+          <wp:inline distT="0" distB="0" distL="0" distR="0">
+            <wp:extent cx="5905500" cy="2466975"/>
+            <wp:effectExtent t="0" r="0" b="0" l="0"/>
+            <wp:docPr id="1" name="" descr="" title=""/>
+            <wp:cNvGraphicFramePr>
+              <a:graphicFrameLocks xmlns:a="http://schemas.openxmlformats.org/drawingml/2006/main" noChangeAspect="1"/>
+            </wp:cNvGraphicFramePr>
+            <a:graphic xmlns:a="http://schemas.openxmlformats.org/drawingml/2006/main">
+              <a:graphicData uri="http://schemas.openxmlformats.org/drawingml/2006/picture">
+                <pic:pic xmlns:pic="http://schemas.openxmlformats.org/drawingml/2006/picture">
+                  <pic:nvPicPr>
+                    <pic:cNvPr id="0" name="" descr=""/>
+                    <pic:cNvPicPr>
+                      <a:picLocks noChangeAspect="1" noChangeArrowheads="1"/>
+                    </pic:cNvPicPr>
+                  </pic:nvPicPr>
+                  <pic:blipFill>
+                    <a:blip r:embed="rId20" cstate="none"/>
+                    <a:srcRect/>
+                    <a:stretch>
+                      <a:fillRect/>
+                    </a:stretch>
+                  </pic:blipFill>
+                  <pic:spPr bwMode="auto">
+                    <a:xfrm>
+                      <a:off x="0" y="0"/>
+                      <a:ext cx="5905500" cy="2466975"/>
+                    </a:xfrm>
+                    <a:prstGeom prst="rect">
+                      <a:avLst/>
+                    </a:prstGeom>
+                  </pic:spPr>
+                </pic:pic>
+              </a:graphicData>
+            </a:graphic>
+          </wp:inline>
+        </w:drawing>
+      </w:r>
+    </w:p>
+    <w:p>
+      <w:pPr>
+        <w:spacing w:after="200" w:line="384"/>
+        <w:jc w:val="center"/>
+      </w:pPr>
+      <w:r>
+        <w:rPr>
+          <w:rFonts w:ascii="휴먼명조" w:cs="휴먼명조" w:eastAsia="휴먼명조" w:hAnsi="휴먼명조"/>
+          <w:sz w:val="20"/>
+          <w:szCs w:val="20"/>
+        </w:rPr>
+        <w:t xml:space="preserve">그림 4-5. 피크전력 저감의 실행 구조. 실선은 구현·평가한 계층, 점선은 제안 계층이다. 운영자는 목표 최대수요, 미룰 수 있는 부하 목록, 예외 처리를 승인한다.</w:t>
+      </w:r>
+    </w:p>
+    <w:p>
+      <w:pPr>
+        <w:spacing w:after="120" w:line="384"/>
+        <w:jc w:val="both"/>
+      </w:pPr>
+      <w:r>
+        <w:rPr>
+          <w:rFonts w:ascii="휴먼명조" w:cs="휴먼명조" w:eastAsia="휴먼명조" w:hAnsi="휴먼명조"/>
+          <w:b/>
+          <w:bCs/>
+          <w:sz w:val="28"/>
+          <w:szCs w:val="28"/>
+        </w:rPr>
+        <w:t xml:space="preserve">계층별 역할.</w:t>
+      </w:r>
+    </w:p>
+    <w:tbl>
+      <w:tblPr>
+        <w:tblW w:type="dxa" w:w="9638"/>
+        <w:tblBorders>
+          <w:top w:val="single" w:color="auto" w:sz="4"/>
+          <w:left w:val="single" w:color="auto" w:sz="4"/>
+          <w:bottom w:val="single" w:color="auto" w:sz="4"/>
+          <w:right w:val="single" w:color="auto" w:sz="4"/>
+          <w:insideH w:val="single" w:color="auto" w:sz="4"/>
+          <w:insideV w:val="single" w:color="auto" w:sz="4"/>
+        </w:tblBorders>
+      </w:tblPr>
+      <w:tblGrid>
+        <w:gridCol w:w="618"/>
+        <w:gridCol w:w="3536"/>
+        <w:gridCol w:w="3536"/>
+        <w:gridCol w:w="1948"/>
+      </w:tblGrid>
+      <w:tr>
+        <w:trPr>
+          <w:cantSplit/>
+          <w:tblHeader/>
+        </w:trPr>
+        <w:tc>
+          <w:tcPr>
+            <w:tcW w:type="dxa" w:w="618"/>
+            <w:tcBorders>
+              <w:top w:val="single" w:color="808080" w:sz="4"/>
+              <w:left w:val="single" w:color="808080" w:sz="4"/>
+              <w:bottom w:val="single" w:color="808080" w:sz="4"/>
+              <w:right w:val="single" w:color="808080" w:sz="4"/>
+            </w:tcBorders>
+            <w:shd w:fill="E7EDF3" w:color="auto" w:val="clear"/>
+            <w:tcMar>
+              <w:top w:type="dxa" w:w="40"/>
+              <w:left w:type="dxa" w:w="80"/>
+              <w:bottom w:type="dxa" w:w="40"/>
+              <w:right w:type="dxa" w:w="80"/>
+            </w:tcMar>
+          </w:tcPr>
+          <w:p>
+            <w:pPr>
+              <w:keepNext/>
+              <w:spacing w:after="0" w:line="276"/>
+              <w:jc w:val="center"/>
+            </w:pPr>
+            <w:r>
+              <w:rPr>
+                <w:rFonts w:ascii="휴먼명조" w:cs="휴먼명조" w:eastAsia="휴먼명조" w:hAnsi="휴먼명조"/>
+                <w:b/>
+                <w:bCs/>
+                <w:sz w:val="20"/>
+                <w:szCs w:val="20"/>
+              </w:rPr>
+              <w:t xml:space="preserve">계층</w:t>
+            </w:r>
+          </w:p>
+        </w:tc>
+        <w:tc>
+          <w:tcPr>
+            <w:tcW w:type="dxa" w:w="3536"/>
+            <w:tcBorders>
+              <w:top w:val="single" w:color="808080" w:sz="4"/>
+              <w:left w:val="single" w:color="808080" w:sz="4"/>
+              <w:bottom w:val="single" w:color="808080" w:sz="4"/>
+              <w:right w:val="single" w:color="808080" w:sz="4"/>
+            </w:tcBorders>
+            <w:shd w:fill="E7EDF3" w:color="auto" w:val="clear"/>
+            <w:tcMar>
+              <w:top w:type="dxa" w:w="40"/>
+              <w:left w:type="dxa" w:w="80"/>
+              <w:bottom w:type="dxa" w:w="40"/>
+              <w:right w:type="dxa" w:w="80"/>
+            </w:tcMar>
+          </w:tcPr>
+          <w:p>
+            <w:pPr>
+              <w:keepNext/>
+              <w:spacing w:after="0" w:line="276"/>
+              <w:jc w:val="center"/>
+            </w:pPr>
+            <w:r>
+              <w:rPr>
+                <w:rFonts w:ascii="휴먼명조" w:cs="휴먼명조" w:eastAsia="휴먼명조" w:hAnsi="휴먼명조"/>
+                <w:b/>
+                <w:bCs/>
+                <w:sz w:val="20"/>
+                <w:szCs w:val="20"/>
+              </w:rPr>
+              <w:t xml:space="preserve">Liu et al.(2026)의 대응</w:t>
+            </w:r>
+          </w:p>
+        </w:tc>
+        <w:tc>
+          <w:tcPr>
+            <w:tcW w:type="dxa" w:w="3536"/>
+            <w:tcBorders>
+              <w:top w:val="single" w:color="808080" w:sz="4"/>
+              <w:left w:val="single" w:color="808080" w:sz="4"/>
+              <w:bottom w:val="single" w:color="808080" w:sz="4"/>
+              <w:right w:val="single" w:color="808080" w:sz="4"/>
+            </w:tcBorders>
+            <w:shd w:fill="E7EDF3" w:color="auto" w:val="clear"/>
+            <w:tcMar>
+              <w:top w:type="dxa" w:w="40"/>
+              <w:left w:type="dxa" w:w="80"/>
+              <w:bottom w:type="dxa" w:w="40"/>
+              <w:right w:type="dxa" w:w="80"/>
+            </w:tcMar>
+          </w:tcPr>
+          <w:p>
+            <w:pPr>
+              <w:keepNext/>
+              <w:spacing w:after="0" w:line="276"/>
+              <w:jc w:val="center"/>
+            </w:pPr>
+            <w:r>
+              <w:rPr>
+                <w:rFonts w:ascii="휴먼명조" w:cs="휴먼명조" w:eastAsia="휴먼명조" w:hAnsi="휴먼명조"/>
+                <w:b/>
+                <w:bCs/>
+                <w:sz w:val="20"/>
+                <w:szCs w:val="20"/>
+              </w:rPr>
+              <w:t xml:space="preserve">이 구조에서의 역할</w:t>
+            </w:r>
+          </w:p>
+        </w:tc>
+        <w:tc>
+          <w:tcPr>
+            <w:tcW w:type="dxa" w:w="1948"/>
+            <w:tcBorders>
+              <w:top w:val="single" w:color="808080" w:sz="4"/>
+              <w:left w:val="single" w:color="808080" w:sz="4"/>
+              <w:bottom w:val="single" w:color="808080" w:sz="4"/>
+              <w:right w:val="single" w:color="808080" w:sz="4"/>
+            </w:tcBorders>
+            <w:shd w:fill="E7EDF3" w:color="auto" w:val="clear"/>
+            <w:tcMar>
+              <w:top w:type="dxa" w:w="40"/>
+              <w:left w:type="dxa" w:w="80"/>
+              <w:bottom w:type="dxa" w:w="40"/>
+              <w:right w:type="dxa" w:w="80"/>
+            </w:tcMar>
+          </w:tcPr>
+          <w:p>
+            <w:pPr>
+              <w:keepNext/>
+              <w:spacing w:after="0" w:line="276"/>
+              <w:jc w:val="center"/>
+            </w:pPr>
+            <w:r>
+              <w:rPr>
+                <w:rFonts w:ascii="휴먼명조" w:cs="휴먼명조" w:eastAsia="휴먼명조" w:hAnsi="휴먼명조"/>
+                <w:b/>
+                <w:bCs/>
+                <w:sz w:val="20"/>
+                <w:szCs w:val="20"/>
+              </w:rPr>
+              <w:t xml:space="preserve">상태</w:t>
+            </w:r>
+          </w:p>
+        </w:tc>
+      </w:tr>
+      <w:tr>
+        <w:trPr>
+          <w:cantSplit/>
+        </w:trPr>
+        <w:tc>
+          <w:tcPr>
+            <w:tcW w:type="dxa" w:w="618"/>
+            <w:tcBorders>
+              <w:top w:val="single" w:color="808080" w:sz="4"/>
+              <w:left w:val="single" w:color="808080" w:sz="4"/>
+              <w:bottom w:val="single" w:color="808080" w:sz="4"/>
+              <w:right w:val="single" w:color="808080" w:sz="4"/>
+            </w:tcBorders>
+            <w:tcMar>
+              <w:top w:type="dxa" w:w="40"/>
+              <w:left w:type="dxa" w:w="80"/>
+              <w:bottom w:type="dxa" w:w="40"/>
+              <w:right w:type="dxa" w:w="80"/>
+            </w:tcMar>
+          </w:tcPr>
+          <w:p>
+            <w:pPr>
+              <w:keepNext/>
+              <w:spacing w:after="0" w:line="276"/>
+              <w:jc w:val="left"/>
+            </w:pPr>
+            <w:r>
+              <w:rPr>
+                <w:rFonts w:ascii="휴먼명조" w:cs="휴먼명조" w:eastAsia="휴먼명조" w:hAnsi="휴먼명조"/>
+                <w:sz w:val="20"/>
+                <w:szCs w:val="20"/>
+              </w:rPr>
+              <w:t xml:space="preserve">지각</w:t>
+            </w:r>
+          </w:p>
+        </w:tc>
+        <w:tc>
+          <w:tcPr>
+            <w:tcW w:type="dxa" w:w="3536"/>
+            <w:tcBorders>
+              <w:top w:val="single" w:color="808080" w:sz="4"/>
+              <w:left w:val="single" w:color="808080" w:sz="4"/>
+              <w:bottom w:val="single" w:color="808080" w:sz="4"/>
+              <w:right w:val="single" w:color="808080" w:sz="4"/>
+            </w:tcBorders>
+            <w:tcMar>
+              <w:top w:type="dxa" w:w="40"/>
+              <w:left w:type="dxa" w:w="80"/>
+              <w:bottom w:type="dxa" w:w="40"/>
+              <w:right w:type="dxa" w:w="80"/>
+            </w:tcMar>
+          </w:tcPr>
+          <w:p>
+            <w:pPr>
+              <w:keepNext/>
+              <w:spacing w:after="0" w:line="276"/>
+              <w:jc w:val="left"/>
+            </w:pPr>
+            <w:r>
+              <w:rPr>
+                <w:rFonts w:ascii="휴먼명조" w:cs="휴먼명조" w:eastAsia="휴먼명조" w:hAnsi="휴먼명조"/>
+                <w:sz w:val="20"/>
+                <w:szCs w:val="20"/>
+              </w:rPr>
+              <w:t xml:space="preserve">다중 모달 자료를 연속으로 모아 교란을 실시간으로 감지</w:t>
+            </w:r>
+          </w:p>
+        </w:tc>
+        <w:tc>
+          <w:tcPr>
+            <w:tcW w:type="dxa" w:w="3536"/>
+            <w:tcBorders>
+              <w:top w:val="single" w:color="808080" w:sz="4"/>
+              <w:left w:val="single" w:color="808080" w:sz="4"/>
+              <w:bottom w:val="single" w:color="808080" w:sz="4"/>
+              <w:right w:val="single" w:color="808080" w:sz="4"/>
+            </w:tcBorders>
+            <w:tcMar>
+              <w:top w:type="dxa" w:w="40"/>
+              <w:left w:type="dxa" w:w="80"/>
+              <w:bottom w:type="dxa" w:w="40"/>
+              <w:right w:type="dxa" w:w="80"/>
+            </w:tcMar>
+          </w:tcPr>
+          <w:p>
+            <w:pPr>
+              <w:keepNext/>
+              <w:spacing w:after="0" w:line="276"/>
+              <w:jc w:val="left"/>
+            </w:pPr>
+            <w:r>
+              <w:rPr>
+                <w:rFonts w:ascii="휴먼명조" w:cs="휴먼명조" w:eastAsia="휴먼명조" w:hAnsi="휴먼명조"/>
+                <w:sz w:val="20"/>
+                <w:szCs w:val="20"/>
+              </w:rPr>
+              <w:t xml:space="preserve">15분 전력 계측, 자료 품질 점검(시각 복원, 0값), 생산량·기상 기록</w:t>
+            </w:r>
+          </w:p>
+        </w:tc>
+        <w:tc>
+          <w:tcPr>
+            <w:tcW w:type="dxa" w:w="1948"/>
+            <w:tcBorders>
+              <w:top w:val="single" w:color="808080" w:sz="4"/>
+              <w:left w:val="single" w:color="808080" w:sz="4"/>
+              <w:bottom w:val="single" w:color="808080" w:sz="4"/>
+              <w:right w:val="single" w:color="808080" w:sz="4"/>
+            </w:tcBorders>
+            <w:tcMar>
+              <w:top w:type="dxa" w:w="40"/>
+              <w:left w:type="dxa" w:w="80"/>
+              <w:bottom w:type="dxa" w:w="40"/>
+              <w:right w:type="dxa" w:w="80"/>
+            </w:tcMar>
+          </w:tcPr>
+          <w:p>
+            <w:pPr>
+              <w:keepNext/>
+              <w:spacing w:after="0" w:line="276"/>
+              <w:jc w:val="left"/>
+            </w:pPr>
+            <w:r>
+              <w:rPr>
+                <w:rFonts w:ascii="휴먼명조" w:cs="휴먼명조" w:eastAsia="휴먼명조" w:hAnsi="휴먼명조"/>
+                <w:sz w:val="20"/>
+                <w:szCs w:val="20"/>
+              </w:rPr>
+              <w:t xml:space="preserve">구현·평가 (1장)</w:t>
+            </w:r>
+          </w:p>
+        </w:tc>
+      </w:tr>
+      <w:tr>
+        <w:trPr>
+          <w:cantSplit/>
+        </w:trPr>
+        <w:tc>
+          <w:tcPr>
+            <w:tcW w:type="dxa" w:w="618"/>
+            <w:tcBorders>
+              <w:top w:val="single" w:color="808080" w:sz="4"/>
+              <w:left w:val="single" w:color="808080" w:sz="4"/>
+              <w:bottom w:val="single" w:color="808080" w:sz="4"/>
+              <w:right w:val="single" w:color="808080" w:sz="4"/>
+            </w:tcBorders>
+            <w:tcMar>
+              <w:top w:type="dxa" w:w="40"/>
+              <w:left w:type="dxa" w:w="80"/>
+              <w:bottom w:type="dxa" w:w="40"/>
+              <w:right w:type="dxa" w:w="80"/>
+            </w:tcMar>
+          </w:tcPr>
+          <w:p>
+            <w:pPr>
+              <w:keepNext/>
+              <w:spacing w:after="0" w:line="276"/>
+              <w:jc w:val="left"/>
+            </w:pPr>
+            <w:r>
+              <w:rPr>
+                <w:rFonts w:ascii="휴먼명조" w:cs="휴먼명조" w:eastAsia="휴먼명조" w:hAnsi="휴먼명조"/>
+                <w:sz w:val="20"/>
+                <w:szCs w:val="20"/>
+              </w:rPr>
+              <w:t xml:space="preserve">분석</w:t>
+            </w:r>
+          </w:p>
+        </w:tc>
+        <w:tc>
+          <w:tcPr>
+            <w:tcW w:type="dxa" w:w="3536"/>
+            <w:tcBorders>
+              <w:top w:val="single" w:color="808080" w:sz="4"/>
+              <w:left w:val="single" w:color="808080" w:sz="4"/>
+              <w:bottom w:val="single" w:color="808080" w:sz="4"/>
+              <w:right w:val="single" w:color="808080" w:sz="4"/>
+            </w:tcBorders>
+            <w:tcMar>
+              <w:top w:type="dxa" w:w="40"/>
+              <w:left w:type="dxa" w:w="80"/>
+              <w:bottom w:type="dxa" w:w="40"/>
+              <w:right w:type="dxa" w:w="80"/>
+            </w:tcMar>
+          </w:tcPr>
+          <w:p>
+            <w:pPr>
+              <w:keepNext/>
+              <w:spacing w:after="0" w:line="276"/>
+              <w:jc w:val="left"/>
+            </w:pPr>
+            <w:r>
+              <w:rPr>
+                <w:rFonts w:ascii="휴먼명조" w:cs="휴먼명조" w:eastAsia="휴먼명조" w:hAnsi="휴먼명조"/>
+                <w:sz w:val="20"/>
+                <w:szCs w:val="20"/>
+              </w:rPr>
+              <w:t xml:space="preserve">자료 상관 분석과 예측 모델로 일정 이상과 고장 추세를 예측</w:t>
+            </w:r>
+          </w:p>
+        </w:tc>
+        <w:tc>
+          <w:tcPr>
+            <w:tcW w:type="dxa" w:w="3536"/>
+            <w:tcBorders>
+              <w:top w:val="single" w:color="808080" w:sz="4"/>
+              <w:left w:val="single" w:color="808080" w:sz="4"/>
+              <w:bottom w:val="single" w:color="808080" w:sz="4"/>
+              <w:right w:val="single" w:color="808080" w:sz="4"/>
+            </w:tcBorders>
+            <w:tcMar>
+              <w:top w:type="dxa" w:w="40"/>
+              <w:left w:type="dxa" w:w="80"/>
+              <w:bottom w:type="dxa" w:w="40"/>
+              <w:right w:type="dxa" w:w="80"/>
+            </w:tcMar>
+          </w:tcPr>
+          <w:p>
+            <w:pPr>
+              <w:keepNext/>
+              <w:spacing w:after="0" w:line="276"/>
+              <w:jc w:val="left"/>
+            </w:pPr>
+            <w:r>
+              <w:rPr>
+                <w:rFonts w:ascii="휴먼명조" w:cs="휴먼명조" w:eastAsia="휴먼명조" w:hAnsi="휴먼명조"/>
+                <w:sz w:val="20"/>
+                <w:szCs w:val="20"/>
+              </w:rPr>
+              <w:t xml:space="preserve">Chronos-2 1~4시간 앞 예측·예측구간·피크 확률, 피크 발생 조건, 비용-손실 판단, 4시간 앞 주의·1시간 앞 조치 경보</w:t>
+            </w:r>
+          </w:p>
+        </w:tc>
+        <w:tc>
+          <w:tcPr>
+            <w:tcW w:type="dxa" w:w="1948"/>
+            <w:tcBorders>
+              <w:top w:val="single" w:color="808080" w:sz="4"/>
+              <w:left w:val="single" w:color="808080" w:sz="4"/>
+              <w:bottom w:val="single" w:color="808080" w:sz="4"/>
+              <w:right w:val="single" w:color="808080" w:sz="4"/>
+            </w:tcBorders>
+            <w:tcMar>
+              <w:top w:type="dxa" w:w="40"/>
+              <w:left w:type="dxa" w:w="80"/>
+              <w:bottom w:type="dxa" w:w="40"/>
+              <w:right w:type="dxa" w:w="80"/>
+            </w:tcMar>
+          </w:tcPr>
+          <w:p>
+            <w:pPr>
+              <w:keepNext/>
+              <w:spacing w:after="0" w:line="276"/>
+              <w:jc w:val="left"/>
+            </w:pPr>
+            <w:r>
+              <w:rPr>
+                <w:rFonts w:ascii="휴먼명조" w:cs="휴먼명조" w:eastAsia="휴먼명조" w:hAnsi="휴먼명조"/>
+                <w:sz w:val="20"/>
+                <w:szCs w:val="20"/>
+              </w:rPr>
+              <w:t xml:space="preserve">구현·평가 (2·3장, 4.2~4.3절)</w:t>
+            </w:r>
+          </w:p>
+        </w:tc>
+      </w:tr>
+      <w:tr>
+        <w:trPr>
+          <w:cantSplit/>
+        </w:trPr>
+        <w:tc>
+          <w:tcPr>
+            <w:tcW w:type="dxa" w:w="618"/>
+            <w:tcBorders>
+              <w:top w:val="single" w:color="808080" w:sz="4"/>
+              <w:left w:val="single" w:color="808080" w:sz="4"/>
+              <w:bottom w:val="single" w:color="808080" w:sz="4"/>
+              <w:right w:val="single" w:color="808080" w:sz="4"/>
+            </w:tcBorders>
+            <w:tcMar>
+              <w:top w:type="dxa" w:w="40"/>
+              <w:left w:type="dxa" w:w="80"/>
+              <w:bottom w:type="dxa" w:w="40"/>
+              <w:right w:type="dxa" w:w="80"/>
+            </w:tcMar>
+          </w:tcPr>
+          <w:p>
+            <w:pPr>
+              <w:keepNext/>
+              <w:spacing w:after="0" w:line="276"/>
+              <w:jc w:val="left"/>
+            </w:pPr>
+            <w:r>
+              <w:rPr>
+                <w:rFonts w:ascii="휴먼명조" w:cs="휴먼명조" w:eastAsia="휴먼명조" w:hAnsi="휴먼명조"/>
+                <w:sz w:val="20"/>
+                <w:szCs w:val="20"/>
+              </w:rPr>
+              <w:t xml:space="preserve">의사결정</w:t>
+            </w:r>
+          </w:p>
+        </w:tc>
+        <w:tc>
+          <w:tcPr>
+            <w:tcW w:type="dxa" w:w="3536"/>
+            <w:tcBorders>
+              <w:top w:val="single" w:color="808080" w:sz="4"/>
+              <w:left w:val="single" w:color="808080" w:sz="4"/>
+              <w:bottom w:val="single" w:color="808080" w:sz="4"/>
+              <w:right w:val="single" w:color="808080" w:sz="4"/>
+            </w:tcBorders>
+            <w:tcMar>
+              <w:top w:type="dxa" w:w="40"/>
+              <w:left w:type="dxa" w:w="80"/>
+              <w:bottom w:type="dxa" w:w="40"/>
+              <w:right w:type="dxa" w:w="80"/>
+            </w:tcMar>
+          </w:tcPr>
+          <w:p>
+            <w:pPr>
+              <w:keepNext/>
+              <w:spacing w:after="0" w:line="276"/>
+              <w:jc w:val="left"/>
+            </w:pPr>
+            <w:r>
+              <w:rPr>
+                <w:rFonts w:ascii="휴먼명조" w:cs="휴먼명조" w:eastAsia="휴먼명조" w:hAnsi="휴먼명조"/>
+                <w:sz w:val="20"/>
+                <w:szCs w:val="20"/>
+              </w:rPr>
+              <w:t xml:space="preserve">자기조직 협상과 동적 게임으로 각 에이전트의 자율과 전체 목표를 맞추고, 사람의 문제 해결 경험을 결합</w:t>
+            </w:r>
+          </w:p>
+        </w:tc>
+        <w:tc>
+          <w:tcPr>
+            <w:tcW w:type="dxa" w:w="3536"/>
+            <w:tcBorders>
+              <w:top w:val="single" w:color="808080" w:sz="4"/>
+              <w:left w:val="single" w:color="808080" w:sz="4"/>
+              <w:bottom w:val="single" w:color="808080" w:sz="4"/>
+              <w:right w:val="single" w:color="808080" w:sz="4"/>
+            </w:tcBorders>
+            <w:tcMar>
+              <w:top w:type="dxa" w:w="40"/>
+              <w:left w:type="dxa" w:w="80"/>
+              <w:bottom w:type="dxa" w:w="40"/>
+              <w:right w:type="dxa" w:w="80"/>
+            </w:tcMar>
+          </w:tcPr>
+          <w:p>
+            <w:pPr>
+              <w:keepNext/>
+              <w:spacing w:after="0" w:line="276"/>
+              <w:jc w:val="left"/>
+            </w:pPr>
+            <w:r>
+              <w:rPr>
+                <w:rFonts w:ascii="휴먼명조" w:cs="휴먼명조" w:eastAsia="휴먼명조" w:hAnsi="휴먼명조"/>
+                <w:sz w:val="20"/>
+                <w:szCs w:val="20"/>
+              </w:rPr>
+              <w:t xml:space="preserve">설비 에이전트가 미룰 부하와 기동 순서를 협상해 나누어 맡는다(전체 목표: 월 최대 15분 전력 ≤ 목표 D). LLM은 운영자가 말로 준 제약을 구조화하고 조치 근거를 설명한다. 운영자가 승인한다</w:t>
+            </w:r>
+          </w:p>
+        </w:tc>
+        <w:tc>
+          <w:tcPr>
+            <w:tcW w:type="dxa" w:w="1948"/>
+            <w:tcBorders>
+              <w:top w:val="single" w:color="808080" w:sz="4"/>
+              <w:left w:val="single" w:color="808080" w:sz="4"/>
+              <w:bottom w:val="single" w:color="808080" w:sz="4"/>
+              <w:right w:val="single" w:color="808080" w:sz="4"/>
+            </w:tcBorders>
+            <w:tcMar>
+              <w:top w:type="dxa" w:w="40"/>
+              <w:left w:type="dxa" w:w="80"/>
+              <w:bottom w:type="dxa" w:w="40"/>
+              <w:right w:type="dxa" w:w="80"/>
+            </w:tcMar>
+          </w:tcPr>
+          <w:p>
+            <w:pPr>
+              <w:keepNext/>
+              <w:spacing w:after="0" w:line="276"/>
+              <w:jc w:val="left"/>
+            </w:pPr>
+            <w:r>
+              <w:rPr>
+                <w:rFonts w:ascii="휴먼명조" w:cs="휴먼명조" w:eastAsia="휴먼명조" w:hAnsi="휴먼명조"/>
+                <w:sz w:val="20"/>
+                <w:szCs w:val="20"/>
+              </w:rPr>
+              <w:t xml:space="preserve">제안</w:t>
+            </w:r>
+          </w:p>
+        </w:tc>
+      </w:tr>
+      <w:tr>
+        <w:trPr>
+          <w:cantSplit/>
+        </w:trPr>
+        <w:tc>
+          <w:tcPr>
+            <w:tcW w:type="dxa" w:w="618"/>
+            <w:tcBorders>
+              <w:top w:val="single" w:color="808080" w:sz="4"/>
+              <w:left w:val="single" w:color="808080" w:sz="4"/>
+              <w:bottom w:val="single" w:color="808080" w:sz="4"/>
+              <w:right w:val="single" w:color="808080" w:sz="4"/>
+            </w:tcBorders>
+            <w:tcMar>
+              <w:top w:type="dxa" w:w="40"/>
+              <w:left w:type="dxa" w:w="80"/>
+              <w:bottom w:type="dxa" w:w="40"/>
+              <w:right w:type="dxa" w:w="80"/>
+            </w:tcMar>
+          </w:tcPr>
+          <w:p>
+            <w:pPr>
+              <w:keepNext w:val="false"/>
+              <w:spacing w:after="0" w:line="276"/>
+              <w:jc w:val="left"/>
+            </w:pPr>
+            <w:r>
+              <w:rPr>
+                <w:rFonts w:ascii="휴먼명조" w:cs="휴먼명조" w:eastAsia="휴먼명조" w:hAnsi="휴먼명조"/>
+                <w:sz w:val="20"/>
+                <w:szCs w:val="20"/>
+              </w:rPr>
+              <w:t xml:space="preserve">실행</w:t>
+            </w:r>
+          </w:p>
+        </w:tc>
+        <w:tc>
+          <w:tcPr>
+            <w:tcW w:type="dxa" w:w="3536"/>
+            <w:tcBorders>
+              <w:top w:val="single" w:color="808080" w:sz="4"/>
+              <w:left w:val="single" w:color="808080" w:sz="4"/>
+              <w:bottom w:val="single" w:color="808080" w:sz="4"/>
+              <w:right w:val="single" w:color="808080" w:sz="4"/>
+            </w:tcBorders>
+            <w:tcMar>
+              <w:top w:type="dxa" w:w="40"/>
+              <w:left w:type="dxa" w:w="80"/>
+              <w:bottom w:type="dxa" w:w="40"/>
+              <w:right w:type="dxa" w:w="80"/>
+            </w:tcMar>
+          </w:tcPr>
+          <w:p>
+            <w:pPr>
+              <w:keepNext w:val="false"/>
+              <w:spacing w:after="0" w:line="276"/>
+              <w:jc w:val="left"/>
+            </w:pPr>
+            <w:r>
+              <w:rPr>
+                <w:rFonts w:ascii="휴먼명조" w:cs="휴먼명조" w:eastAsia="휴먼명조" w:hAnsi="휴먼명조"/>
+                <w:sz w:val="20"/>
+                <w:szCs w:val="20"/>
+              </w:rPr>
+              <w:t xml:space="preserve">물리 설비를 기능 모듈에 대응시킨 LLM 기반 설비 에이전트</w:t>
+            </w:r>
+          </w:p>
+        </w:tc>
+        <w:tc>
+          <w:tcPr>
+            <w:tcW w:type="dxa" w:w="3536"/>
+            <w:tcBorders>
+              <w:top w:val="single" w:color="808080" w:sz="4"/>
+              <w:left w:val="single" w:color="808080" w:sz="4"/>
+              <w:bottom w:val="single" w:color="808080" w:sz="4"/>
+              <w:right w:val="single" w:color="808080" w:sz="4"/>
+            </w:tcBorders>
+            <w:tcMar>
+              <w:top w:type="dxa" w:w="40"/>
+              <w:left w:type="dxa" w:w="80"/>
+              <w:bottom w:type="dxa" w:w="40"/>
+              <w:right w:type="dxa" w:w="80"/>
+            </w:tcMar>
+          </w:tcPr>
+          <w:p>
+            <w:pPr>
+              <w:keepNext w:val="false"/>
+              <w:spacing w:after="0" w:line="276"/>
+              <w:jc w:val="left"/>
+            </w:pPr>
+            <w:r>
+              <w:rPr>
+                <w:rFonts w:ascii="휴먼명조" w:cs="휴먼명조" w:eastAsia="휴먼명조" w:hAnsi="휴먼명조"/>
+                <w:sz w:val="20"/>
+                <w:szCs w:val="20"/>
+              </w:rPr>
+              <w:t xml:space="preserve">설비 에이전트가 설비 제어(PLC)로 기동 지연, 부하 지연, 여유 구간 재투입을 수행</w:t>
+            </w:r>
+          </w:p>
+        </w:tc>
+        <w:tc>
+          <w:tcPr>
+            <w:tcW w:type="dxa" w:w="1948"/>
+            <w:tcBorders>
+              <w:top w:val="single" w:color="808080" w:sz="4"/>
+              <w:left w:val="single" w:color="808080" w:sz="4"/>
+              <w:bottom w:val="single" w:color="808080" w:sz="4"/>
+              <w:right w:val="single" w:color="808080" w:sz="4"/>
+            </w:tcBorders>
+            <w:tcMar>
+              <w:top w:type="dxa" w:w="40"/>
+              <w:left w:type="dxa" w:w="80"/>
+              <w:bottom w:type="dxa" w:w="40"/>
+              <w:right w:type="dxa" w:w="80"/>
+            </w:tcMar>
+          </w:tcPr>
+          <w:p>
+            <w:pPr>
+              <w:keepNext w:val="false"/>
+              <w:spacing w:after="0" w:line="276"/>
+              <w:jc w:val="left"/>
+            </w:pPr>
+            <w:r>
+              <w:rPr>
+                <w:rFonts w:ascii="휴먼명조" w:cs="휴먼명조" w:eastAsia="휴먼명조" w:hAnsi="휴먼명조"/>
+                <w:sz w:val="20"/>
+                <w:szCs w:val="20"/>
+              </w:rPr>
+              <w:t xml:space="preserve">제안 (제어 규칙은 4.4절에서 모의)</w:t>
+            </w:r>
+          </w:p>
+        </w:tc>
+      </w:tr>
+    </w:tbl>
+    <w:p>
+      <w:pPr>
+        <w:spacing w:after="120"/>
+      </w:pPr>
+    </w:p>
+    <w:p>
+      <w:pPr>
+        <w:spacing w:after="120" w:line="384"/>
+        <w:jc w:val="both"/>
+      </w:pPr>
+      <w:r>
+        <w:rPr>
+          <w:rFonts w:ascii="휴먼명조" w:cs="휴먼명조" w:eastAsia="휴먼명조" w:hAnsi="휴먼명조"/>
+          <w:b/>
+          <w:bCs/>
+          <w:sz w:val="28"/>
+          <w:szCs w:val="28"/>
+        </w:rPr>
+        <w:t xml:space="preserve">실행 계층의 요구 사양.</w:t>
+      </w:r>
+      <w:r>
+        <w:rPr>
+          <w:rFonts w:ascii="휴먼명조" w:cs="휴먼명조" w:eastAsia="휴먼명조" w:hAnsi="휴먼명조"/>
+          <w:sz w:val="28"/>
+          <w:szCs w:val="28"/>
+        </w:rPr>
+        <w:t xml:space="preserve"> 목표 최대수요 200, 미룰 수 있는 부하 10%의 모의 운영(4.4절 방안 ①)이 평가 구간 38일 동안 실제로 요구한 조치는 다음과 같다.</w:t>
+      </w:r>
+    </w:p>
+    <w:tbl>
+      <w:tblPr>
+        <w:tblW w:type="dxa" w:w="9638"/>
+        <w:tblBorders>
+          <w:top w:val="single" w:color="auto" w:sz="4"/>
+          <w:left w:val="single" w:color="auto" w:sz="4"/>
+          <w:bottom w:val="single" w:color="auto" w:sz="4"/>
+          <w:right w:val="single" w:color="auto" w:sz="4"/>
+          <w:insideH w:val="single" w:color="auto" w:sz="4"/>
+          <w:insideV w:val="single" w:color="auto" w:sz="4"/>
+        </w:tblBorders>
+      </w:tblPr>
+      <w:tblGrid>
+        <w:gridCol w:w="1156"/>
+        <w:gridCol w:w="5140"/>
+        <w:gridCol w:w="3342"/>
+      </w:tblGrid>
+      <w:tr>
+        <w:trPr>
+          <w:cantSplit/>
+          <w:tblHeader/>
+        </w:trPr>
+        <w:tc>
+          <w:tcPr>
+            <w:tcW w:type="dxa" w:w="1156"/>
+            <w:tcBorders>
+              <w:top w:val="single" w:color="808080" w:sz="4"/>
+              <w:left w:val="single" w:color="808080" w:sz="4"/>
+              <w:bottom w:val="single" w:color="808080" w:sz="4"/>
+              <w:right w:val="single" w:color="808080" w:sz="4"/>
+            </w:tcBorders>
+            <w:shd w:fill="E7EDF3" w:color="auto" w:val="clear"/>
+            <w:tcMar>
+              <w:top w:type="dxa" w:w="40"/>
+              <w:left w:type="dxa" w:w="80"/>
+              <w:bottom w:type="dxa" w:w="40"/>
+              <w:right w:type="dxa" w:w="80"/>
+            </w:tcMar>
+          </w:tcPr>
+          <w:p>
+            <w:pPr>
+              <w:keepNext/>
+              <w:spacing w:after="0" w:line="276"/>
+              <w:jc w:val="center"/>
+            </w:pPr>
+            <w:r>
+              <w:rPr>
+                <w:rFonts w:ascii="휴먼명조" w:cs="휴먼명조" w:eastAsia="휴먼명조" w:hAnsi="휴먼명조"/>
+                <w:b/>
+                <w:bCs/>
+                <w:sz w:val="20"/>
+                <w:szCs w:val="20"/>
+              </w:rPr>
+              <w:t xml:space="preserve">항목</w:t>
+            </w:r>
+          </w:p>
+        </w:tc>
+        <w:tc>
+          <w:tcPr>
+            <w:tcW w:type="dxa" w:w="5140"/>
+            <w:tcBorders>
+              <w:top w:val="single" w:color="808080" w:sz="4"/>
+              <w:left w:val="single" w:color="808080" w:sz="4"/>
+              <w:bottom w:val="single" w:color="808080" w:sz="4"/>
+              <w:right w:val="single" w:color="808080" w:sz="4"/>
+            </w:tcBorders>
+            <w:shd w:fill="E7EDF3" w:color="auto" w:val="clear"/>
+            <w:tcMar>
+              <w:top w:type="dxa" w:w="40"/>
+              <w:left w:type="dxa" w:w="80"/>
+              <w:bottom w:type="dxa" w:w="40"/>
+              <w:right w:type="dxa" w:w="80"/>
+            </w:tcMar>
+          </w:tcPr>
+          <w:p>
+            <w:pPr>
+              <w:keepNext/>
+              <w:spacing w:after="0" w:line="276"/>
+              <w:jc w:val="center"/>
+            </w:pPr>
+            <w:r>
+              <w:rPr>
+                <w:rFonts w:ascii="휴먼명조" w:cs="휴먼명조" w:eastAsia="휴먼명조" w:hAnsi="휴먼명조"/>
+                <w:b/>
+                <w:bCs/>
+                <w:sz w:val="20"/>
+                <w:szCs w:val="20"/>
+              </w:rPr>
+              <w:t xml:space="preserve">값</w:t>
+            </w:r>
+          </w:p>
+        </w:tc>
+        <w:tc>
+          <w:tcPr>
+            <w:tcW w:type="dxa" w:w="3342"/>
+            <w:tcBorders>
+              <w:top w:val="single" w:color="808080" w:sz="4"/>
+              <w:left w:val="single" w:color="808080" w:sz="4"/>
+              <w:bottom w:val="single" w:color="808080" w:sz="4"/>
+              <w:right w:val="single" w:color="808080" w:sz="4"/>
+            </w:tcBorders>
+            <w:shd w:fill="E7EDF3" w:color="auto" w:val="clear"/>
+            <w:tcMar>
+              <w:top w:type="dxa" w:w="40"/>
+              <w:left w:type="dxa" w:w="80"/>
+              <w:bottom w:type="dxa" w:w="40"/>
+              <w:right w:type="dxa" w:w="80"/>
+            </w:tcMar>
+          </w:tcPr>
+          <w:p>
+            <w:pPr>
+              <w:keepNext/>
+              <w:spacing w:after="0" w:line="276"/>
+              <w:jc w:val="center"/>
+            </w:pPr>
+            <w:r>
+              <w:rPr>
+                <w:rFonts w:ascii="휴먼명조" w:cs="휴먼명조" w:eastAsia="휴먼명조" w:hAnsi="휴먼명조"/>
+                <w:b/>
+                <w:bCs/>
+                <w:sz w:val="20"/>
+                <w:szCs w:val="20"/>
+              </w:rPr>
+              <w:t xml:space="preserve">실행 계층 설계에 주는 의미</w:t>
+            </w:r>
+          </w:p>
+        </w:tc>
+      </w:tr>
+      <w:tr>
+        <w:trPr>
+          <w:cantSplit/>
+        </w:trPr>
+        <w:tc>
+          <w:tcPr>
+            <w:tcW w:type="dxa" w:w="1156"/>
+            <w:tcBorders>
+              <w:top w:val="single" w:color="808080" w:sz="4"/>
+              <w:left w:val="single" w:color="808080" w:sz="4"/>
+              <w:bottom w:val="single" w:color="808080" w:sz="4"/>
+              <w:right w:val="single" w:color="808080" w:sz="4"/>
+            </w:tcBorders>
+            <w:tcMar>
+              <w:top w:type="dxa" w:w="40"/>
+              <w:left w:type="dxa" w:w="80"/>
+              <w:bottom w:type="dxa" w:w="40"/>
+              <w:right w:type="dxa" w:w="80"/>
+            </w:tcMar>
+          </w:tcPr>
+          <w:p>
+            <w:pPr>
+              <w:keepNext/>
+              <w:spacing w:after="0" w:line="276"/>
+              <w:jc w:val="left"/>
+            </w:pPr>
+            <w:r>
+              <w:rPr>
+                <w:rFonts w:ascii="휴먼명조" w:cs="휴먼명조" w:eastAsia="휴먼명조" w:hAnsi="휴먼명조"/>
+                <w:sz w:val="20"/>
+                <w:szCs w:val="20"/>
+              </w:rPr>
+              <w:t xml:space="preserve">조치 빈도</w:t>
+            </w:r>
+          </w:p>
+        </w:tc>
+        <w:tc>
+          <w:tcPr>
+            <w:tcW w:type="dxa" w:w="5140"/>
+            <w:tcBorders>
+              <w:top w:val="single" w:color="808080" w:sz="4"/>
+              <w:left w:val="single" w:color="808080" w:sz="4"/>
+              <w:bottom w:val="single" w:color="808080" w:sz="4"/>
+              <w:right w:val="single" w:color="808080" w:sz="4"/>
+            </w:tcBorders>
+            <w:tcMar>
+              <w:top w:type="dxa" w:w="40"/>
+              <w:left w:type="dxa" w:w="80"/>
+              <w:bottom w:type="dxa" w:w="40"/>
+              <w:right w:type="dxa" w:w="80"/>
+            </w:tcMar>
+          </w:tcPr>
+          <w:p>
+            <w:pPr>
+              <w:keepNext/>
+              <w:spacing w:after="0" w:line="276"/>
+              <w:jc w:val="left"/>
+            </w:pPr>
+            <w:r>
+              <w:rPr>
+                <w:rFonts w:ascii="휴먼명조" w:cs="휴먼명조" w:eastAsia="휴먼명조" w:hAnsi="휴먼명조"/>
+                <w:sz w:val="20"/>
+                <w:szCs w:val="20"/>
+              </w:rPr>
+              <w:t xml:space="preserve">38일 중 5일, 모두 13번 (하루 최대 5번)</w:t>
+            </w:r>
+          </w:p>
+        </w:tc>
+        <w:tc>
+          <w:tcPr>
+            <w:tcW w:type="dxa" w:w="3342"/>
+            <w:tcBorders>
+              <w:top w:val="single" w:color="808080" w:sz="4"/>
+              <w:left w:val="single" w:color="808080" w:sz="4"/>
+              <w:bottom w:val="single" w:color="808080" w:sz="4"/>
+              <w:right w:val="single" w:color="808080" w:sz="4"/>
+            </w:tcBorders>
+            <w:tcMar>
+              <w:top w:type="dxa" w:w="40"/>
+              <w:left w:type="dxa" w:w="80"/>
+              <w:bottom w:type="dxa" w:w="40"/>
+              <w:right w:type="dxa" w:w="80"/>
+            </w:tcMar>
+          </w:tcPr>
+          <w:p>
+            <w:pPr>
+              <w:keepNext/>
+              <w:spacing w:after="0" w:line="276"/>
+              <w:jc w:val="left"/>
+            </w:pPr>
+            <w:r>
+              <w:rPr>
+                <w:rFonts w:ascii="휴먼명조" w:cs="휴먼명조" w:eastAsia="휴먼명조" w:hAnsi="휴먼명조"/>
+                <w:sz w:val="20"/>
+                <w:szCs w:val="20"/>
+              </w:rPr>
+              <w:t xml:space="preserve">협상은 드물게, 특정한 날에 몰려 일어난다</w:t>
+            </w:r>
+          </w:p>
+        </w:tc>
+      </w:tr>
+      <w:tr>
+        <w:trPr>
+          <w:cantSplit/>
+        </w:trPr>
+        <w:tc>
+          <w:tcPr>
+            <w:tcW w:type="dxa" w:w="1156"/>
+            <w:tcBorders>
+              <w:top w:val="single" w:color="808080" w:sz="4"/>
+              <w:left w:val="single" w:color="808080" w:sz="4"/>
+              <w:bottom w:val="single" w:color="808080" w:sz="4"/>
+              <w:right w:val="single" w:color="808080" w:sz="4"/>
+            </w:tcBorders>
+            <w:tcMar>
+              <w:top w:type="dxa" w:w="40"/>
+              <w:left w:type="dxa" w:w="80"/>
+              <w:bottom w:type="dxa" w:w="40"/>
+              <w:right w:type="dxa" w:w="80"/>
+            </w:tcMar>
+          </w:tcPr>
+          <w:p>
+            <w:pPr>
+              <w:keepNext/>
+              <w:spacing w:after="0" w:line="276"/>
+              <w:jc w:val="left"/>
+            </w:pPr>
+            <w:r>
+              <w:rPr>
+                <w:rFonts w:ascii="휴먼명조" w:cs="휴먼명조" w:eastAsia="휴먼명조" w:hAnsi="휴먼명조"/>
+                <w:sz w:val="20"/>
+                <w:szCs w:val="20"/>
+              </w:rPr>
+              <w:t xml:space="preserve">조치 크기</w:t>
+            </w:r>
+          </w:p>
+        </w:tc>
+        <w:tc>
+          <w:tcPr>
+            <w:tcW w:type="dxa" w:w="5140"/>
+            <w:tcBorders>
+              <w:top w:val="single" w:color="808080" w:sz="4"/>
+              <w:left w:val="single" w:color="808080" w:sz="4"/>
+              <w:bottom w:val="single" w:color="808080" w:sz="4"/>
+              <w:right w:val="single" w:color="808080" w:sz="4"/>
+            </w:tcBorders>
+            <w:tcMar>
+              <w:top w:type="dxa" w:w="40"/>
+              <w:left w:type="dxa" w:w="80"/>
+              <w:bottom w:type="dxa" w:w="40"/>
+              <w:right w:type="dxa" w:w="80"/>
+            </w:tcMar>
+          </w:tcPr>
+          <w:p>
+            <w:pPr>
+              <w:keepNext/>
+              <w:spacing w:after="0" w:line="276"/>
+              <w:jc w:val="left"/>
+            </w:pPr>
+            <w:r>
+              <w:rPr>
+                <w:rFonts w:ascii="휴먼명조" w:cs="휴먼명조" w:eastAsia="휴먼명조" w:hAnsi="휴먼명조"/>
+                <w:sz w:val="20"/>
+                <w:szCs w:val="20"/>
+              </w:rPr>
+              <w:t xml:space="preserve">1회 평균 5.5 (그 시점 부하의 2.6%), 최대 18</w:t>
+            </w:r>
+          </w:p>
+        </w:tc>
+        <w:tc>
+          <w:tcPr>
+            <w:tcW w:type="dxa" w:w="3342"/>
+            <w:tcBorders>
+              <w:top w:val="single" w:color="808080" w:sz="4"/>
+              <w:left w:val="single" w:color="808080" w:sz="4"/>
+              <w:bottom w:val="single" w:color="808080" w:sz="4"/>
+              <w:right w:val="single" w:color="808080" w:sz="4"/>
+            </w:tcBorders>
+            <w:tcMar>
+              <w:top w:type="dxa" w:w="40"/>
+              <w:left w:type="dxa" w:w="80"/>
+              <w:bottom w:type="dxa" w:w="40"/>
+              <w:right w:type="dxa" w:w="80"/>
+            </w:tcMar>
+          </w:tcPr>
+          <w:p>
+            <w:pPr>
+              <w:keepNext/>
+              <w:spacing w:after="0" w:line="276"/>
+              <w:jc w:val="left"/>
+            </w:pPr>
+            <w:r>
+              <w:rPr>
+                <w:rFonts w:ascii="휴먼명조" w:cs="휴먼명조" w:eastAsia="휴먼명조" w:hAnsi="휴먼명조"/>
+                <w:sz w:val="20"/>
+                <w:szCs w:val="20"/>
+              </w:rPr>
+              <w:t xml:space="preserve">설비 한두 대의 지연으로 감당할 수 있는 크기</w:t>
+            </w:r>
+          </w:p>
+        </w:tc>
+      </w:tr>
+      <w:tr>
+        <w:trPr>
+          <w:cantSplit/>
+        </w:trPr>
+        <w:tc>
+          <w:tcPr>
+            <w:tcW w:type="dxa" w:w="1156"/>
+            <w:tcBorders>
+              <w:top w:val="single" w:color="808080" w:sz="4"/>
+              <w:left w:val="single" w:color="808080" w:sz="4"/>
+              <w:bottom w:val="single" w:color="808080" w:sz="4"/>
+              <w:right w:val="single" w:color="808080" w:sz="4"/>
+            </w:tcBorders>
+            <w:tcMar>
+              <w:top w:type="dxa" w:w="40"/>
+              <w:left w:type="dxa" w:w="80"/>
+              <w:bottom w:type="dxa" w:w="40"/>
+              <w:right w:type="dxa" w:w="80"/>
+            </w:tcMar>
+          </w:tcPr>
+          <w:p>
+            <w:pPr>
+              <w:keepNext/>
+              <w:spacing w:after="0" w:line="276"/>
+              <w:jc w:val="left"/>
+            </w:pPr>
+            <w:r>
+              <w:rPr>
+                <w:rFonts w:ascii="휴먼명조" w:cs="휴먼명조" w:eastAsia="휴먼명조" w:hAnsi="휴먼명조"/>
+                <w:sz w:val="20"/>
+                <w:szCs w:val="20"/>
+              </w:rPr>
+              <w:t xml:space="preserve">동시에 미룬 부하</w:t>
+            </w:r>
+          </w:p>
+        </w:tc>
+        <w:tc>
+          <w:tcPr>
+            <w:tcW w:type="dxa" w:w="5140"/>
+            <w:tcBorders>
+              <w:top w:val="single" w:color="808080" w:sz="4"/>
+              <w:left w:val="single" w:color="808080" w:sz="4"/>
+              <w:bottom w:val="single" w:color="808080" w:sz="4"/>
+              <w:right w:val="single" w:color="808080" w:sz="4"/>
+            </w:tcBorders>
+            <w:tcMar>
+              <w:top w:type="dxa" w:w="40"/>
+              <w:left w:type="dxa" w:w="80"/>
+              <w:bottom w:type="dxa" w:w="40"/>
+              <w:right w:type="dxa" w:w="80"/>
+            </w:tcMar>
+          </w:tcPr>
+          <w:p>
+            <w:pPr>
+              <w:keepNext/>
+              <w:spacing w:after="0" w:line="276"/>
+              <w:jc w:val="left"/>
+            </w:pPr>
+            <w:r>
+              <w:rPr>
+                <w:rFonts w:ascii="휴먼명조" w:cs="휴먼명조" w:eastAsia="휴먼명조" w:hAnsi="휴먼명조"/>
+                <w:sz w:val="20"/>
+                <w:szCs w:val="20"/>
+              </w:rPr>
+              <w:t xml:space="preserve">최대 36</w:t>
+            </w:r>
+          </w:p>
+        </w:tc>
+        <w:tc>
+          <w:tcPr>
+            <w:tcW w:type="dxa" w:w="3342"/>
+            <w:tcBorders>
+              <w:top w:val="single" w:color="808080" w:sz="4"/>
+              <w:left w:val="single" w:color="808080" w:sz="4"/>
+              <w:bottom w:val="single" w:color="808080" w:sz="4"/>
+              <w:right w:val="single" w:color="808080" w:sz="4"/>
+            </w:tcBorders>
+            <w:tcMar>
+              <w:top w:type="dxa" w:w="40"/>
+              <w:left w:type="dxa" w:w="80"/>
+              <w:bottom w:type="dxa" w:w="40"/>
+              <w:right w:type="dxa" w:w="80"/>
+            </w:tcMar>
+          </w:tcPr>
+          <w:p>
+            <w:pPr>
+              <w:keepNext/>
+              <w:spacing w:after="0" w:line="276"/>
+              <w:jc w:val="left"/>
+            </w:pPr>
+            <w:r>
+              <w:rPr>
+                <w:rFonts w:ascii="휴먼명조" w:cs="휴먼명조" w:eastAsia="휴먼명조" w:hAnsi="휴먼명조"/>
+                <w:sz w:val="20"/>
+                <w:szCs w:val="20"/>
+              </w:rPr>
+              <w:t xml:space="preserve">재투입 계획이 다뤄야 할 최대량</w:t>
+            </w:r>
+          </w:p>
+        </w:tc>
+      </w:tr>
+      <w:tr>
+        <w:trPr>
+          <w:cantSplit/>
+        </w:trPr>
+        <w:tc>
+          <w:tcPr>
+            <w:tcW w:type="dxa" w:w="1156"/>
+            <w:tcBorders>
+              <w:top w:val="single" w:color="808080" w:sz="4"/>
+              <w:left w:val="single" w:color="808080" w:sz="4"/>
+              <w:bottom w:val="single" w:color="808080" w:sz="4"/>
+              <w:right w:val="single" w:color="808080" w:sz="4"/>
+            </w:tcBorders>
+            <w:tcMar>
+              <w:top w:type="dxa" w:w="40"/>
+              <w:left w:type="dxa" w:w="80"/>
+              <w:bottom w:type="dxa" w:w="40"/>
+              <w:right w:type="dxa" w:w="80"/>
+            </w:tcMar>
+          </w:tcPr>
+          <w:p>
+            <w:pPr>
+              <w:keepNext/>
+              <w:spacing w:after="0" w:line="276"/>
+              <w:jc w:val="left"/>
+            </w:pPr>
+            <w:r>
+              <w:rPr>
+                <w:rFonts w:ascii="휴먼명조" w:cs="휴먼명조" w:eastAsia="휴먼명조" w:hAnsi="휴먼명조"/>
+                <w:sz w:val="20"/>
+                <w:szCs w:val="20"/>
+              </w:rPr>
+              <w:t xml:space="preserve">지연 시간</w:t>
+            </w:r>
+          </w:p>
+        </w:tc>
+        <w:tc>
+          <w:tcPr>
+            <w:tcW w:type="dxa" w:w="5140"/>
+            <w:tcBorders>
+              <w:top w:val="single" w:color="808080" w:sz="4"/>
+              <w:left w:val="single" w:color="808080" w:sz="4"/>
+              <w:bottom w:val="single" w:color="808080" w:sz="4"/>
+              <w:right w:val="single" w:color="808080" w:sz="4"/>
+            </w:tcBorders>
+            <w:tcMar>
+              <w:top w:type="dxa" w:w="40"/>
+              <w:left w:type="dxa" w:w="80"/>
+              <w:bottom w:type="dxa" w:w="40"/>
+              <w:right w:type="dxa" w:w="80"/>
+            </w:tcMar>
+          </w:tcPr>
+          <w:p>
+            <w:pPr>
+              <w:keepNext/>
+              <w:spacing w:after="0" w:line="276"/>
+              <w:jc w:val="left"/>
+            </w:pPr>
+            <w:r>
+              <w:rPr>
+                <w:rFonts w:ascii="휴먼명조" w:cs="휴먼명조" w:eastAsia="휴먼명조" w:hAnsi="휴먼명조"/>
+                <w:sz w:val="20"/>
+                <w:szCs w:val="20"/>
+              </w:rPr>
+              <w:t xml:space="preserve">최대 1시간. 1시간을 넘겨 강제로 재투입한 경우 0번</w:t>
+            </w:r>
+          </w:p>
+        </w:tc>
+        <w:tc>
+          <w:tcPr>
+            <w:tcW w:type="dxa" w:w="3342"/>
+            <w:tcBorders>
+              <w:top w:val="single" w:color="808080" w:sz="4"/>
+              <w:left w:val="single" w:color="808080" w:sz="4"/>
+              <w:bottom w:val="single" w:color="808080" w:sz="4"/>
+              <w:right w:val="single" w:color="808080" w:sz="4"/>
+            </w:tcBorders>
+            <w:tcMar>
+              <w:top w:type="dxa" w:w="40"/>
+              <w:left w:type="dxa" w:w="80"/>
+              <w:bottom w:type="dxa" w:w="40"/>
+              <w:right w:type="dxa" w:w="80"/>
+            </w:tcMar>
+          </w:tcPr>
+          <w:p>
+            <w:pPr>
+              <w:keepNext/>
+              <w:spacing w:after="0" w:line="276"/>
+              <w:jc w:val="left"/>
+            </w:pPr>
+            <w:r>
+              <w:rPr>
+                <w:rFonts w:ascii="휴먼명조" w:cs="휴먼명조" w:eastAsia="휴먼명조" w:hAnsi="휴먼명조"/>
+                <w:sz w:val="20"/>
+                <w:szCs w:val="20"/>
+              </w:rPr>
+              <w:t xml:space="preserve">공정에 주는 영향이 짧다</w:t>
+            </w:r>
+          </w:p>
+        </w:tc>
+      </w:tr>
+      <w:tr>
+        <w:trPr>
+          <w:cantSplit/>
+        </w:trPr>
+        <w:tc>
+          <w:tcPr>
+            <w:tcW w:type="dxa" w:w="1156"/>
+            <w:tcBorders>
+              <w:top w:val="single" w:color="808080" w:sz="4"/>
+              <w:left w:val="single" w:color="808080" w:sz="4"/>
+              <w:bottom w:val="single" w:color="808080" w:sz="4"/>
+              <w:right w:val="single" w:color="808080" w:sz="4"/>
+            </w:tcBorders>
+            <w:tcMar>
+              <w:top w:type="dxa" w:w="40"/>
+              <w:left w:type="dxa" w:w="80"/>
+              <w:bottom w:type="dxa" w:w="40"/>
+              <w:right w:type="dxa" w:w="80"/>
+            </w:tcMar>
+          </w:tcPr>
+          <w:p>
+            <w:pPr>
+              <w:keepNext/>
+              <w:spacing w:after="0" w:line="276"/>
+              <w:jc w:val="left"/>
+            </w:pPr>
+            <w:r>
+              <w:rPr>
+                <w:rFonts w:ascii="휴먼명조" w:cs="휴먼명조" w:eastAsia="휴먼명조" w:hAnsi="휴먼명조"/>
+                <w:sz w:val="20"/>
+                <w:szCs w:val="20"/>
+              </w:rPr>
+              <w:t xml:space="preserve">협상 여유</w:t>
+            </w:r>
+          </w:p>
+        </w:tc>
+        <w:tc>
+          <w:tcPr>
+            <w:tcW w:type="dxa" w:w="5140"/>
+            <w:tcBorders>
+              <w:top w:val="single" w:color="808080" w:sz="4"/>
+              <w:left w:val="single" w:color="808080" w:sz="4"/>
+              <w:bottom w:val="single" w:color="808080" w:sz="4"/>
+              <w:right w:val="single" w:color="808080" w:sz="4"/>
+            </w:tcBorders>
+            <w:tcMar>
+              <w:top w:type="dxa" w:w="40"/>
+              <w:left w:type="dxa" w:w="80"/>
+              <w:bottom w:type="dxa" w:w="40"/>
+              <w:right w:type="dxa" w:w="80"/>
+            </w:tcMar>
+          </w:tcPr>
+          <w:p>
+            <w:pPr>
+              <w:keepNext/>
+              <w:spacing w:after="0" w:line="276"/>
+              <w:jc w:val="left"/>
+            </w:pPr>
+            <w:r>
+              <w:rPr>
+                <w:rFonts w:ascii="휴먼명조" w:cs="휴먼명조" w:eastAsia="휴먼명조" w:hAnsi="휴먼명조"/>
+                <w:sz w:val="20"/>
+                <w:szCs w:val="20"/>
+              </w:rPr>
+              <w:t xml:space="preserve">목표를 넘은 13개 구간 모두 사전 경보. 첫 경보부터 구간 시작까지 중앙값 225분, 최소 135분</w:t>
+            </w:r>
+          </w:p>
+        </w:tc>
+        <w:tc>
+          <w:tcPr>
+            <w:tcW w:type="dxa" w:w="3342"/>
+            <w:tcBorders>
+              <w:top w:val="single" w:color="808080" w:sz="4"/>
+              <w:left w:val="single" w:color="808080" w:sz="4"/>
+              <w:bottom w:val="single" w:color="808080" w:sz="4"/>
+              <w:right w:val="single" w:color="808080" w:sz="4"/>
+            </w:tcBorders>
+            <w:tcMar>
+              <w:top w:type="dxa" w:w="40"/>
+              <w:left w:type="dxa" w:w="80"/>
+              <w:bottom w:type="dxa" w:w="40"/>
+              <w:right w:type="dxa" w:w="80"/>
+            </w:tcMar>
+          </w:tcPr>
+          <w:p>
+            <w:pPr>
+              <w:keepNext/>
+              <w:spacing w:after="0" w:line="276"/>
+              <w:jc w:val="left"/>
+            </w:pPr>
+            <w:r>
+              <w:rPr>
+                <w:rFonts w:ascii="휴먼명조" w:cs="휴먼명조" w:eastAsia="휴먼명조" w:hAnsi="휴먼명조"/>
+                <w:sz w:val="20"/>
+                <w:szCs w:val="20"/>
+              </w:rPr>
+              <w:t xml:space="preserve">에이전트 협상과 운영자 승인에 2시간 이상 확보</w:t>
+            </w:r>
+          </w:p>
+        </w:tc>
+      </w:tr>
+      <w:tr>
+        <w:trPr>
+          <w:cantSplit/>
+        </w:trPr>
+        <w:tc>
+          <w:tcPr>
+            <w:tcW w:type="dxa" w:w="1156"/>
+            <w:tcBorders>
+              <w:top w:val="single" w:color="808080" w:sz="4"/>
+              <w:left w:val="single" w:color="808080" w:sz="4"/>
+              <w:bottom w:val="single" w:color="808080" w:sz="4"/>
+              <w:right w:val="single" w:color="808080" w:sz="4"/>
+            </w:tcBorders>
+            <w:tcMar>
+              <w:top w:type="dxa" w:w="40"/>
+              <w:left w:type="dxa" w:w="80"/>
+              <w:bottom w:type="dxa" w:w="40"/>
+              <w:right w:type="dxa" w:w="80"/>
+            </w:tcMar>
+          </w:tcPr>
+          <w:p>
+            <w:pPr>
+              <w:keepNext w:val="false"/>
+              <w:spacing w:after="0" w:line="276"/>
+              <w:jc w:val="left"/>
+            </w:pPr>
+            <w:r>
+              <w:rPr>
+                <w:rFonts w:ascii="휴먼명조" w:cs="휴먼명조" w:eastAsia="휴먼명조" w:hAnsi="휴먼명조"/>
+                <w:sz w:val="20"/>
+                <w:szCs w:val="20"/>
+              </w:rPr>
+              <w:t xml:space="preserve">조치 시점</w:t>
+            </w:r>
+          </w:p>
+        </w:tc>
+        <w:tc>
+          <w:tcPr>
+            <w:tcW w:type="dxa" w:w="5140"/>
+            <w:tcBorders>
+              <w:top w:val="single" w:color="808080" w:sz="4"/>
+              <w:left w:val="single" w:color="808080" w:sz="4"/>
+              <w:bottom w:val="single" w:color="808080" w:sz="4"/>
+              <w:right w:val="single" w:color="808080" w:sz="4"/>
+            </w:tcBorders>
+            <w:tcMar>
+              <w:top w:type="dxa" w:w="40"/>
+              <w:left w:type="dxa" w:w="80"/>
+              <w:bottom w:type="dxa" w:w="40"/>
+              <w:right w:type="dxa" w:w="80"/>
+            </w:tcMar>
+          </w:tcPr>
+          <w:p>
+            <w:pPr>
+              <w:keepNext w:val="false"/>
+              <w:spacing w:after="0" w:line="276"/>
+              <w:jc w:val="left"/>
+            </w:pPr>
+            <w:r>
+              <w:rPr>
+                <w:rFonts w:ascii="휴먼명조" w:cs="휴먼명조" w:eastAsia="휴먼명조" w:hAnsi="휴먼명조"/>
+                <w:sz w:val="20"/>
+                <w:szCs w:val="20"/>
+              </w:rPr>
+              <w:t xml:space="preserve">13번 중 5번 아침 기동 직후, 3번 휴식 후 재가동 직후, 3번 휴식·점심 직전</w:t>
+            </w:r>
+          </w:p>
+        </w:tc>
+        <w:tc>
+          <w:tcPr>
+            <w:tcW w:type="dxa" w:w="3342"/>
+            <w:tcBorders>
+              <w:top w:val="single" w:color="808080" w:sz="4"/>
+              <w:left w:val="single" w:color="808080" w:sz="4"/>
+              <w:bottom w:val="single" w:color="808080" w:sz="4"/>
+              <w:right w:val="single" w:color="808080" w:sz="4"/>
+            </w:tcBorders>
+            <w:tcMar>
+              <w:top w:type="dxa" w:w="40"/>
+              <w:left w:type="dxa" w:w="80"/>
+              <w:bottom w:type="dxa" w:w="40"/>
+              <w:right w:type="dxa" w:w="80"/>
+            </w:tcMar>
+          </w:tcPr>
+          <w:p>
+            <w:pPr>
+              <w:keepNext w:val="false"/>
+              <w:spacing w:after="0" w:line="276"/>
+              <w:jc w:val="left"/>
+            </w:pPr>
+            <w:r>
+              <w:rPr>
+                <w:rFonts w:ascii="휴먼명조" w:cs="휴먼명조" w:eastAsia="휴먼명조" w:hAnsi="휴먼명조"/>
+                <w:sz w:val="20"/>
+                <w:szCs w:val="20"/>
+              </w:rPr>
+              <w:t xml:space="preserve">협상 대상은 주로 기동 순서와 작업 시작 시점</w:t>
+            </w:r>
+          </w:p>
+        </w:tc>
+      </w:tr>
+    </w:tbl>
+    <w:p>
+      <w:pPr>
+        <w:spacing w:after="120"/>
+      </w:pPr>
+    </w:p>
+    <w:p>
+      <w:pPr>
+        <w:spacing w:after="120" w:line="384"/>
+        <w:jc w:val="both"/>
+      </w:pPr>
+      <w:r>
+        <w:rPr>
+          <w:rFonts w:ascii="휴먼명조" w:cs="휴먼명조" w:eastAsia="휴먼명조" w:hAnsi="휴먼명조"/>
+          <w:sz w:val="28"/>
+          <w:szCs w:val="28"/>
+        </w:rPr>
+        <w:t xml:space="preserve">조치가 작고, 드물고, 2시간 이상 앞서 알 수 있다. 사람이 매번 판단하기보다 설비 단위 자동 실행에 알맞은 조건이다. 조치는 특정한 날에 몰리므로(하루 최대 5번), 그날의 협상을 미리 준비하게 하는 4시간 앞 주의 경보의 역할이 크다.</w:t>
+      </w:r>
+    </w:p>
+    <w:p>
+      <w:pPr>
+        <w:spacing w:after="120" w:line="384"/>
+        <w:jc w:val="both"/>
+      </w:pPr>
+      <w:r>
+        <w:rPr>
+          <w:rFonts w:ascii="휴먼명조" w:cs="휴먼명조" w:eastAsia="휴먼명조" w:hAnsi="휴먼명조"/>
+          <w:b/>
+          <w:bCs/>
+          <w:sz w:val="28"/>
+          <w:szCs w:val="28"/>
+        </w:rPr>
+        <w:t xml:space="preserve">LLM의 역할과 경계.</w:t>
+      </w:r>
+    </w:p>
+    <w:p>
+      <w:pPr>
+        <w:pStyle w:val="ListParagraph"/>
+        <w:numPr>
+          <w:ilvl w:val="0"/>
+          <w:numId w:val="2"/>
+        </w:numPr>
+        <w:spacing w:after="60" w:line="384"/>
+        <w:jc w:val="both"/>
+      </w:pPr>
+      <w:r>
+        <w:rPr>
+          <w:rFonts w:ascii="휴먼명조" w:cs="휴먼명조" w:eastAsia="휴먼명조" w:hAnsi="휴먼명조"/>
+          <w:b/>
+          <w:bCs/>
+          <w:sz w:val="28"/>
+          <w:szCs w:val="28"/>
+        </w:rPr>
+        <w:t xml:space="preserve">맡는 일.</w:t>
+      </w:r>
+      <w:r>
+        <w:rPr>
+          <w:rFonts w:ascii="휴먼명조" w:cs="휴먼명조" w:eastAsia="휴먼명조" w:hAnsi="휴먼명조"/>
+          <w:sz w:val="28"/>
+          <w:szCs w:val="28"/>
+        </w:rPr>
+        <w:t xml:space="preserve"> 운영자가 말로 준 제약(예: "3호기는 오전에 정지할 수 없다", "오늘 납기 물량은 옮기지 않는다")을 에이전트가 읽는 구조화된 제약으로 바꾼다. 조치 안내문을 근거 수치와 함께 작성한다.</w:t>
+      </w:r>
+    </w:p>
+    <w:p>
+      <w:pPr>
+        <w:pStyle w:val="ListParagraph"/>
+        <w:numPr>
+          <w:ilvl w:val="0"/>
+          <w:numId w:val="2"/>
+        </w:numPr>
+        <w:spacing w:after="60" w:line="384"/>
+        <w:jc w:val="both"/>
+      </w:pPr>
+      <w:r>
+        <w:rPr>
+          <w:rFonts w:ascii="휴먼명조" w:cs="휴먼명조" w:eastAsia="휴먼명조" w:hAnsi="휴먼명조"/>
+          <w:b/>
+          <w:bCs/>
+          <w:sz w:val="28"/>
+          <w:szCs w:val="28"/>
+        </w:rPr>
+        <w:t xml:space="preserve">맡지 않는 일.</w:t>
+      </w:r>
+      <w:r>
+        <w:rPr>
+          <w:rFonts w:ascii="휴먼명조" w:cs="휴먼명조" w:eastAsia="휴먼명조" w:hAnsi="휴먼명조"/>
+          <w:sz w:val="28"/>
+          <w:szCs w:val="28"/>
+        </w:rPr>
+        <w:t xml:space="preserve"> 줄일 양과 시점의 수치는 예측·경보·상한 규칙이 정한다. LLM은 설비를 직접 제어하지 않는다.</w:t>
+      </w:r>
+    </w:p>
+    <w:p>
+      <w:pPr>
+        <w:pStyle w:val="ListParagraph"/>
+        <w:numPr>
+          <w:ilvl w:val="0"/>
+          <w:numId w:val="2"/>
+        </w:numPr>
+        <w:spacing w:after="60" w:line="384"/>
+        <w:jc w:val="both"/>
+      </w:pPr>
+      <w:r>
+        <w:rPr>
+          <w:rFonts w:ascii="휴먼명조" w:cs="휴먼명조" w:eastAsia="휴먼명조" w:hAnsi="휴먼명조"/>
+          <w:b/>
+          <w:bCs/>
+          <w:sz w:val="28"/>
+          <w:szCs w:val="28"/>
+        </w:rPr>
+        <w:t xml:space="preserve">검증 방법.</w:t>
+      </w:r>
+      <w:r>
+        <w:rPr>
+          <w:rFonts w:ascii="휴먼명조" w:cs="휴먼명조" w:eastAsia="휴먼명조" w:hAnsi="휴먼명조"/>
+          <w:sz w:val="28"/>
+          <w:szCs w:val="28"/>
+        </w:rPr>
+        <w:t xml:space="preserve"> 같은 입력으로 정형 템플릿과 LLM 안내문을 만들고, 수치 일치, 근거 없는 주장, 빠진 조건을 비교한다.</w:t>
+      </w:r>
+    </w:p>
+    <w:p>
+      <w:pPr>
+        <w:spacing w:after="120" w:line="384"/>
+        <w:jc w:val="both"/>
+      </w:pPr>
+      <w:r>
+        <w:rPr>
+          <w:rFonts w:ascii="휴먼명조" w:cs="휴먼명조" w:eastAsia="휴먼명조" w:hAnsi="휴먼명조"/>
+          <w:b/>
+          <w:bCs/>
+          <w:sz w:val="28"/>
+          <w:szCs w:val="28"/>
+        </w:rPr>
+        <w:t xml:space="preserve">단계별 도입.</w:t>
+      </w:r>
+    </w:p>
+    <w:tbl>
+      <w:tblPr>
+        <w:tblW w:type="dxa" w:w="9638"/>
+        <w:tblBorders>
+          <w:top w:val="single" w:color="auto" w:sz="4"/>
+          <w:left w:val="single" w:color="auto" w:sz="4"/>
+          <w:bottom w:val="single" w:color="auto" w:sz="4"/>
+          <w:right w:val="single" w:color="auto" w:sz="4"/>
+          <w:insideH w:val="single" w:color="auto" w:sz="4"/>
+          <w:insideV w:val="single" w:color="auto" w:sz="4"/>
+        </w:tblBorders>
+      </w:tblPr>
+      <w:tblGrid>
+        <w:gridCol w:w="642"/>
+        <w:gridCol w:w="3671"/>
+        <w:gridCol w:w="2294"/>
+        <w:gridCol w:w="3031"/>
+      </w:tblGrid>
+      <w:tr>
+        <w:trPr>
+          <w:cantSplit/>
+          <w:tblHeader/>
+        </w:trPr>
+        <w:tc>
+          <w:tcPr>
+            <w:tcW w:type="dxa" w:w="642"/>
+            <w:tcBorders>
+              <w:top w:val="single" w:color="808080" w:sz="4"/>
+              <w:left w:val="single" w:color="808080" w:sz="4"/>
+              <w:bottom w:val="single" w:color="808080" w:sz="4"/>
+              <w:right w:val="single" w:color="808080" w:sz="4"/>
+            </w:tcBorders>
+            <w:shd w:fill="E7EDF3" w:color="auto" w:val="clear"/>
+            <w:tcMar>
+              <w:top w:type="dxa" w:w="40"/>
+              <w:left w:type="dxa" w:w="80"/>
+              <w:bottom w:type="dxa" w:w="40"/>
+              <w:right w:type="dxa" w:w="80"/>
+            </w:tcMar>
+          </w:tcPr>
+          <w:p>
+            <w:pPr>
+              <w:keepNext/>
+              <w:spacing w:after="0" w:line="276"/>
+              <w:jc w:val="center"/>
+            </w:pPr>
+            <w:r>
+              <w:rPr>
+                <w:rFonts w:ascii="휴먼명조" w:cs="휴먼명조" w:eastAsia="휴먼명조" w:hAnsi="휴먼명조"/>
+                <w:b/>
+                <w:bCs/>
+                <w:sz w:val="20"/>
+                <w:szCs w:val="20"/>
+              </w:rPr>
+              <w:t xml:space="preserve">단계</w:t>
+            </w:r>
+          </w:p>
+        </w:tc>
+        <w:tc>
+          <w:tcPr>
+            <w:tcW w:type="dxa" w:w="3671"/>
+            <w:tcBorders>
+              <w:top w:val="single" w:color="808080" w:sz="4"/>
+              <w:left w:val="single" w:color="808080" w:sz="4"/>
+              <w:bottom w:val="single" w:color="808080" w:sz="4"/>
+              <w:right w:val="single" w:color="808080" w:sz="4"/>
+            </w:tcBorders>
+            <w:shd w:fill="E7EDF3" w:color="auto" w:val="clear"/>
+            <w:tcMar>
+              <w:top w:type="dxa" w:w="40"/>
+              <w:left w:type="dxa" w:w="80"/>
+              <w:bottom w:type="dxa" w:w="40"/>
+              <w:right w:type="dxa" w:w="80"/>
+            </w:tcMar>
+          </w:tcPr>
+          <w:p>
+            <w:pPr>
+              <w:keepNext/>
+              <w:spacing w:after="0" w:line="276"/>
+              <w:jc w:val="center"/>
+            </w:pPr>
+            <w:r>
+              <w:rPr>
+                <w:rFonts w:ascii="휴먼명조" w:cs="휴먼명조" w:eastAsia="휴먼명조" w:hAnsi="휴먼명조"/>
+                <w:b/>
+                <w:bCs/>
+                <w:sz w:val="20"/>
+                <w:szCs w:val="20"/>
+              </w:rPr>
+              <w:t xml:space="preserve">내용</w:t>
+            </w:r>
+          </w:p>
+        </w:tc>
+        <w:tc>
+          <w:tcPr>
+            <w:tcW w:type="dxa" w:w="2294"/>
+            <w:tcBorders>
+              <w:top w:val="single" w:color="808080" w:sz="4"/>
+              <w:left w:val="single" w:color="808080" w:sz="4"/>
+              <w:bottom w:val="single" w:color="808080" w:sz="4"/>
+              <w:right w:val="single" w:color="808080" w:sz="4"/>
+            </w:tcBorders>
+            <w:shd w:fill="E7EDF3" w:color="auto" w:val="clear"/>
+            <w:tcMar>
+              <w:top w:type="dxa" w:w="40"/>
+              <w:left w:type="dxa" w:w="80"/>
+              <w:bottom w:type="dxa" w:w="40"/>
+              <w:right w:type="dxa" w:w="80"/>
+            </w:tcMar>
+          </w:tcPr>
+          <w:p>
+            <w:pPr>
+              <w:keepNext/>
+              <w:spacing w:after="0" w:line="276"/>
+              <w:jc w:val="center"/>
+            </w:pPr>
+            <w:r>
+              <w:rPr>
+                <w:rFonts w:ascii="휴먼명조" w:cs="휴먼명조" w:eastAsia="휴먼명조" w:hAnsi="휴먼명조"/>
+                <w:b/>
+                <w:bCs/>
+                <w:sz w:val="20"/>
+                <w:szCs w:val="20"/>
+              </w:rPr>
+              <w:t xml:space="preserve">운영자의 역할</w:t>
+            </w:r>
+          </w:p>
+        </w:tc>
+        <w:tc>
+          <w:tcPr>
+            <w:tcW w:type="dxa" w:w="3031"/>
+            <w:tcBorders>
+              <w:top w:val="single" w:color="808080" w:sz="4"/>
+              <w:left w:val="single" w:color="808080" w:sz="4"/>
+              <w:bottom w:val="single" w:color="808080" w:sz="4"/>
+              <w:right w:val="single" w:color="808080" w:sz="4"/>
+            </w:tcBorders>
+            <w:shd w:fill="E7EDF3" w:color="auto" w:val="clear"/>
+            <w:tcMar>
+              <w:top w:type="dxa" w:w="40"/>
+              <w:left w:type="dxa" w:w="80"/>
+              <w:bottom w:type="dxa" w:w="40"/>
+              <w:right w:type="dxa" w:w="80"/>
+            </w:tcMar>
+          </w:tcPr>
+          <w:p>
+            <w:pPr>
+              <w:keepNext/>
+              <w:spacing w:after="0" w:line="276"/>
+              <w:jc w:val="center"/>
+            </w:pPr>
+            <w:r>
+              <w:rPr>
+                <w:rFonts w:ascii="휴먼명조" w:cs="휴먼명조" w:eastAsia="휴먼명조" w:hAnsi="휴먼명조"/>
+                <w:b/>
+                <w:bCs/>
+                <w:sz w:val="20"/>
+                <w:szCs w:val="20"/>
+              </w:rPr>
+              <w:t xml:space="preserve">확인 지표</w:t>
+            </w:r>
+          </w:p>
+        </w:tc>
+      </w:tr>
+      <w:tr>
+        <w:trPr>
+          <w:cantSplit/>
+        </w:trPr>
+        <w:tc>
+          <w:tcPr>
+            <w:tcW w:type="dxa" w:w="642"/>
+            <w:tcBorders>
+              <w:top w:val="single" w:color="808080" w:sz="4"/>
+              <w:left w:val="single" w:color="808080" w:sz="4"/>
+              <w:bottom w:val="single" w:color="808080" w:sz="4"/>
+              <w:right w:val="single" w:color="808080" w:sz="4"/>
+            </w:tcBorders>
+            <w:tcMar>
+              <w:top w:type="dxa" w:w="40"/>
+              <w:left w:type="dxa" w:w="80"/>
+              <w:bottom w:type="dxa" w:w="40"/>
+              <w:right w:type="dxa" w:w="80"/>
+            </w:tcMar>
+          </w:tcPr>
+          <w:p>
+            <w:pPr>
+              <w:keepNext/>
+              <w:spacing w:after="0" w:line="276"/>
+              <w:jc w:val="left"/>
+            </w:pPr>
+            <w:r>
+              <w:rPr>
+                <w:rFonts w:ascii="휴먼명조" w:cs="휴먼명조" w:eastAsia="휴먼명조" w:hAnsi="휴먼명조"/>
+                <w:sz w:val="20"/>
+                <w:szCs w:val="20"/>
+              </w:rPr>
+              <w:t xml:space="preserve">1</w:t>
+            </w:r>
+          </w:p>
+        </w:tc>
+        <w:tc>
+          <w:tcPr>
+            <w:tcW w:type="dxa" w:w="3671"/>
+            <w:tcBorders>
+              <w:top w:val="single" w:color="808080" w:sz="4"/>
+              <w:left w:val="single" w:color="808080" w:sz="4"/>
+              <w:bottom w:val="single" w:color="808080" w:sz="4"/>
+              <w:right w:val="single" w:color="808080" w:sz="4"/>
+            </w:tcBorders>
+            <w:tcMar>
+              <w:top w:type="dxa" w:w="40"/>
+              <w:left w:type="dxa" w:w="80"/>
+              <w:bottom w:type="dxa" w:w="40"/>
+              <w:right w:type="dxa" w:w="80"/>
+            </w:tcMar>
+          </w:tcPr>
+          <w:p>
+            <w:pPr>
+              <w:keepNext/>
+              <w:spacing w:after="0" w:line="276"/>
+              <w:jc w:val="left"/>
+            </w:pPr>
+            <w:r>
+              <w:rPr>
+                <w:rFonts w:ascii="휴먼명조" w:cs="휴먼명조" w:eastAsia="휴먼명조" w:hAnsi="휴먼명조"/>
+                <w:sz w:val="20"/>
+                <w:szCs w:val="20"/>
+              </w:rPr>
+              <w:t xml:space="preserve">2단계 경보 운영. 운영자가 기동 순서와 생산 일정을 직접 조정 (방안 ②·③)</w:t>
+            </w:r>
+          </w:p>
+        </w:tc>
+        <w:tc>
+          <w:tcPr>
+            <w:tcW w:type="dxa" w:w="2294"/>
+            <w:tcBorders>
+              <w:top w:val="single" w:color="808080" w:sz="4"/>
+              <w:left w:val="single" w:color="808080" w:sz="4"/>
+              <w:bottom w:val="single" w:color="808080" w:sz="4"/>
+              <w:right w:val="single" w:color="808080" w:sz="4"/>
+            </w:tcBorders>
+            <w:tcMar>
+              <w:top w:type="dxa" w:w="40"/>
+              <w:left w:type="dxa" w:w="80"/>
+              <w:bottom w:type="dxa" w:w="40"/>
+              <w:right w:type="dxa" w:w="80"/>
+            </w:tcMar>
+          </w:tcPr>
+          <w:p>
+            <w:pPr>
+              <w:keepNext/>
+              <w:spacing w:after="0" w:line="276"/>
+              <w:jc w:val="left"/>
+            </w:pPr>
+            <w:r>
+              <w:rPr>
+                <w:rFonts w:ascii="휴먼명조" w:cs="휴먼명조" w:eastAsia="휴먼명조" w:hAnsi="휴먼명조"/>
+                <w:sz w:val="20"/>
+                <w:szCs w:val="20"/>
+              </w:rPr>
+              <w:t xml:space="preserve">모든 조치 결정</w:t>
+            </w:r>
+          </w:p>
+        </w:tc>
+        <w:tc>
+          <w:tcPr>
+            <w:tcW w:type="dxa" w:w="3031"/>
+            <w:tcBorders>
+              <w:top w:val="single" w:color="808080" w:sz="4"/>
+              <w:left w:val="single" w:color="808080" w:sz="4"/>
+              <w:bottom w:val="single" w:color="808080" w:sz="4"/>
+              <w:right w:val="single" w:color="808080" w:sz="4"/>
+            </w:tcBorders>
+            <w:tcMar>
+              <w:top w:type="dxa" w:w="40"/>
+              <w:left w:type="dxa" w:w="80"/>
+              <w:bottom w:type="dxa" w:w="40"/>
+              <w:right w:type="dxa" w:w="80"/>
+            </w:tcMar>
+          </w:tcPr>
+          <w:p>
+            <w:pPr>
+              <w:keepNext/>
+              <w:spacing w:after="0" w:line="276"/>
+              <w:jc w:val="left"/>
+            </w:pPr>
+            <w:r>
+              <w:rPr>
+                <w:rFonts w:ascii="휴먼명조" w:cs="휴먼명조" w:eastAsia="휴먼명조" w:hAnsi="휴먼명조"/>
+                <w:sz w:val="20"/>
+                <w:szCs w:val="20"/>
+              </w:rPr>
+              <w:t xml:space="preserve">일·월 최대 구간 사전 포착률, 근무일당 오경보 사건</w:t>
+            </w:r>
+          </w:p>
+        </w:tc>
+      </w:tr>
+      <w:tr>
+        <w:trPr>
+          <w:cantSplit/>
+        </w:trPr>
+        <w:tc>
+          <w:tcPr>
+            <w:tcW w:type="dxa" w:w="642"/>
+            <w:tcBorders>
+              <w:top w:val="single" w:color="808080" w:sz="4"/>
+              <w:left w:val="single" w:color="808080" w:sz="4"/>
+              <w:bottom w:val="single" w:color="808080" w:sz="4"/>
+              <w:right w:val="single" w:color="808080" w:sz="4"/>
+            </w:tcBorders>
+            <w:tcMar>
+              <w:top w:type="dxa" w:w="40"/>
+              <w:left w:type="dxa" w:w="80"/>
+              <w:bottom w:type="dxa" w:w="40"/>
+              <w:right w:type="dxa" w:w="80"/>
+            </w:tcMar>
+          </w:tcPr>
+          <w:p>
+            <w:pPr>
+              <w:keepNext/>
+              <w:spacing w:after="0" w:line="276"/>
+              <w:jc w:val="left"/>
+            </w:pPr>
+            <w:r>
+              <w:rPr>
+                <w:rFonts w:ascii="휴먼명조" w:cs="휴먼명조" w:eastAsia="휴먼명조" w:hAnsi="휴먼명조"/>
+                <w:sz w:val="20"/>
+                <w:szCs w:val="20"/>
+              </w:rPr>
+              <w:t xml:space="preserve">2</w:t>
+            </w:r>
+          </w:p>
+        </w:tc>
+        <w:tc>
+          <w:tcPr>
+            <w:tcW w:type="dxa" w:w="3671"/>
+            <w:tcBorders>
+              <w:top w:val="single" w:color="808080" w:sz="4"/>
+              <w:left w:val="single" w:color="808080" w:sz="4"/>
+              <w:bottom w:val="single" w:color="808080" w:sz="4"/>
+              <w:right w:val="single" w:color="808080" w:sz="4"/>
+            </w:tcBorders>
+            <w:tcMar>
+              <w:top w:type="dxa" w:w="40"/>
+              <w:left w:type="dxa" w:w="80"/>
+              <w:bottom w:type="dxa" w:w="40"/>
+              <w:right w:type="dxa" w:w="80"/>
+            </w:tcMar>
+          </w:tcPr>
+          <w:p>
+            <w:pPr>
+              <w:keepNext/>
+              <w:spacing w:after="0" w:line="276"/>
+              <w:jc w:val="left"/>
+            </w:pPr>
+            <w:r>
+              <w:rPr>
+                <w:rFonts w:ascii="휴먼명조" w:cs="휴먼명조" w:eastAsia="휴먼명조" w:hAnsi="휴먼명조"/>
+                <w:sz w:val="20"/>
+                <w:szCs w:val="20"/>
+              </w:rPr>
+              <w:t xml:space="preserve">경보로 준비하고, 상한 제어 장치가 목표 초과분을 자동으로 미룸 (방안 ①)</w:t>
+            </w:r>
+          </w:p>
+        </w:tc>
+        <w:tc>
+          <w:tcPr>
+            <w:tcW w:type="dxa" w:w="2294"/>
+            <w:tcBorders>
+              <w:top w:val="single" w:color="808080" w:sz="4"/>
+              <w:left w:val="single" w:color="808080" w:sz="4"/>
+              <w:bottom w:val="single" w:color="808080" w:sz="4"/>
+              <w:right w:val="single" w:color="808080" w:sz="4"/>
+            </w:tcBorders>
+            <w:tcMar>
+              <w:top w:type="dxa" w:w="40"/>
+              <w:left w:type="dxa" w:w="80"/>
+              <w:bottom w:type="dxa" w:w="40"/>
+              <w:right w:type="dxa" w:w="80"/>
+            </w:tcMar>
+          </w:tcPr>
+          <w:p>
+            <w:pPr>
+              <w:keepNext/>
+              <w:spacing w:after="0" w:line="276"/>
+              <w:jc w:val="left"/>
+            </w:pPr>
+            <w:r>
+              <w:rPr>
+                <w:rFonts w:ascii="휴먼명조" w:cs="휴먼명조" w:eastAsia="휴먼명조" w:hAnsi="휴먼명조"/>
+                <w:sz w:val="20"/>
+                <w:szCs w:val="20"/>
+              </w:rPr>
+              <w:t xml:space="preserve">목표 최대수요와 미룰 수 있는 부하 목록 승인</w:t>
+            </w:r>
+          </w:p>
+        </w:tc>
+        <w:tc>
+          <w:tcPr>
+            <w:tcW w:type="dxa" w:w="3031"/>
+            <w:tcBorders>
+              <w:top w:val="single" w:color="808080" w:sz="4"/>
+              <w:left w:val="single" w:color="808080" w:sz="4"/>
+              <w:bottom w:val="single" w:color="808080" w:sz="4"/>
+              <w:right w:val="single" w:color="808080" w:sz="4"/>
+            </w:tcBorders>
+            <w:tcMar>
+              <w:top w:type="dxa" w:w="40"/>
+              <w:left w:type="dxa" w:w="80"/>
+              <w:bottom w:type="dxa" w:w="40"/>
+              <w:right w:type="dxa" w:w="80"/>
+            </w:tcMar>
+          </w:tcPr>
+          <w:p>
+            <w:pPr>
+              <w:keepNext/>
+              <w:spacing w:after="0" w:line="276"/>
+              <w:jc w:val="left"/>
+            </w:pPr>
+            <w:r>
+              <w:rPr>
+                <w:rFonts w:ascii="휴먼명조" w:cs="휴먼명조" w:eastAsia="휴먼명조" w:hAnsi="휴먼명조"/>
+                <w:sz w:val="20"/>
+                <w:szCs w:val="20"/>
+              </w:rPr>
+              <w:t xml:space="preserve">조치 횟수, 미룬 부하, 월 최대 15분 전력</w:t>
+            </w:r>
+          </w:p>
+        </w:tc>
+      </w:tr>
+      <w:tr>
+        <w:trPr>
+          <w:cantSplit/>
+        </w:trPr>
+        <w:tc>
+          <w:tcPr>
+            <w:tcW w:type="dxa" w:w="642"/>
+            <w:tcBorders>
+              <w:top w:val="single" w:color="808080" w:sz="4"/>
+              <w:left w:val="single" w:color="808080" w:sz="4"/>
+              <w:bottom w:val="single" w:color="808080" w:sz="4"/>
+              <w:right w:val="single" w:color="808080" w:sz="4"/>
+            </w:tcBorders>
+            <w:tcMar>
+              <w:top w:type="dxa" w:w="40"/>
+              <w:left w:type="dxa" w:w="80"/>
+              <w:bottom w:type="dxa" w:w="40"/>
+              <w:right w:type="dxa" w:w="80"/>
+            </w:tcMar>
+          </w:tcPr>
+          <w:p>
+            <w:pPr>
+              <w:keepNext w:val="false"/>
+              <w:spacing w:after="0" w:line="276"/>
+              <w:jc w:val="left"/>
+            </w:pPr>
+            <w:r>
+              <w:rPr>
+                <w:rFonts w:ascii="휴먼명조" w:cs="휴먼명조" w:eastAsia="휴먼명조" w:hAnsi="휴먼명조"/>
+                <w:sz w:val="20"/>
+                <w:szCs w:val="20"/>
+              </w:rPr>
+              <w:t xml:space="preserve">3</w:t>
+            </w:r>
+          </w:p>
+        </w:tc>
+        <w:tc>
+          <w:tcPr>
+            <w:tcW w:type="dxa" w:w="3671"/>
+            <w:tcBorders>
+              <w:top w:val="single" w:color="808080" w:sz="4"/>
+              <w:left w:val="single" w:color="808080" w:sz="4"/>
+              <w:bottom w:val="single" w:color="808080" w:sz="4"/>
+              <w:right w:val="single" w:color="808080" w:sz="4"/>
+            </w:tcBorders>
+            <w:tcMar>
+              <w:top w:type="dxa" w:w="40"/>
+              <w:left w:type="dxa" w:w="80"/>
+              <w:bottom w:type="dxa" w:w="40"/>
+              <w:right w:type="dxa" w:w="80"/>
+            </w:tcMar>
+          </w:tcPr>
+          <w:p>
+            <w:pPr>
+              <w:keepNext w:val="false"/>
+              <w:spacing w:after="0" w:line="276"/>
+              <w:jc w:val="left"/>
+            </w:pPr>
+            <w:r>
+              <w:rPr>
+                <w:rFonts w:ascii="휴먼명조" w:cs="휴먼명조" w:eastAsia="휴먼명조" w:hAnsi="휴먼명조"/>
+                <w:sz w:val="20"/>
+                <w:szCs w:val="20"/>
+              </w:rPr>
+              <w:t xml:space="preserve">설비 에이전트 협상과 LLM 제약 해석 (피지컬 AI)</w:t>
+            </w:r>
+          </w:p>
+        </w:tc>
+        <w:tc>
+          <w:tcPr>
+            <w:tcW w:type="dxa" w:w="2294"/>
+            <w:tcBorders>
+              <w:top w:val="single" w:color="808080" w:sz="4"/>
+              <w:left w:val="single" w:color="808080" w:sz="4"/>
+              <w:bottom w:val="single" w:color="808080" w:sz="4"/>
+              <w:right w:val="single" w:color="808080" w:sz="4"/>
+            </w:tcBorders>
+            <w:tcMar>
+              <w:top w:type="dxa" w:w="40"/>
+              <w:left w:type="dxa" w:w="80"/>
+              <w:bottom w:type="dxa" w:w="40"/>
+              <w:right w:type="dxa" w:w="80"/>
+            </w:tcMar>
+          </w:tcPr>
+          <w:p>
+            <w:pPr>
+              <w:keepNext w:val="false"/>
+              <w:spacing w:after="0" w:line="276"/>
+              <w:jc w:val="left"/>
+            </w:pPr>
+            <w:r>
+              <w:rPr>
+                <w:rFonts w:ascii="휴먼명조" w:cs="휴먼명조" w:eastAsia="휴먼명조" w:hAnsi="휴먼명조"/>
+                <w:sz w:val="20"/>
+                <w:szCs w:val="20"/>
+              </w:rPr>
+              <w:t xml:space="preserve">에이전트 제안 승인, 예외 처리</w:t>
+            </w:r>
+          </w:p>
+        </w:tc>
+        <w:tc>
+          <w:tcPr>
+            <w:tcW w:type="dxa" w:w="3031"/>
+            <w:tcBorders>
+              <w:top w:val="single" w:color="808080" w:sz="4"/>
+              <w:left w:val="single" w:color="808080" w:sz="4"/>
+              <w:bottom w:val="single" w:color="808080" w:sz="4"/>
+              <w:right w:val="single" w:color="808080" w:sz="4"/>
+            </w:tcBorders>
+            <w:tcMar>
+              <w:top w:type="dxa" w:w="40"/>
+              <w:left w:type="dxa" w:w="80"/>
+              <w:bottom w:type="dxa" w:w="40"/>
+              <w:right w:type="dxa" w:w="80"/>
+            </w:tcMar>
+          </w:tcPr>
+          <w:p>
+            <w:pPr>
+              <w:keepNext w:val="false"/>
+              <w:spacing w:after="0" w:line="276"/>
+              <w:jc w:val="left"/>
+            </w:pPr>
+            <w:r>
+              <w:rPr>
+                <w:rFonts w:ascii="휴먼명조" w:cs="휴먼명조" w:eastAsia="휴먼명조" w:hAnsi="휴먼명조"/>
+                <w:sz w:val="20"/>
+                <w:szCs w:val="20"/>
+              </w:rPr>
+              <w:t xml:space="preserve">제약 위반 0건, 안내문 수치 일치율, 월 최대 15분 전력</w:t>
+            </w:r>
+          </w:p>
+        </w:tc>
+      </w:tr>
+    </w:tbl>
+    <w:p>
+      <w:pPr>
+        <w:spacing w:after="120"/>
+      </w:pPr>
+    </w:p>
+    <w:p>
+      <w:pPr>
+        <w:spacing w:after="120" w:line="384"/>
+        <w:jc w:val="both"/>
+      </w:pPr>
+      <w:r>
+        <w:rPr>
+          <w:rFonts w:ascii="휴먼명조" w:cs="휴먼명조" w:eastAsia="휴먼명조" w:hAnsi="휴먼명조"/>
+          <w:sz w:val="28"/>
+          <w:szCs w:val="28"/>
+        </w:rPr>
+        <w:t xml:space="preserve">각 단계는 앞 단계와 같은 지표로 비교한 뒤 다음 단계로 넘어간다.</w:t>
+      </w:r>
+    </w:p>
+    <w:p>
+      <w:pPr>
+        <w:spacing w:after="120" w:line="384"/>
+        <w:jc w:val="both"/>
+      </w:pPr>
+      <w:r>
+        <w:rPr>
+          <w:rFonts w:ascii="휴먼명조" w:cs="휴먼명조" w:eastAsia="휴먼명조" w:hAnsi="휴먼명조"/>
+          <w:b/>
+          <w:bCs/>
+          <w:sz w:val="28"/>
+          <w:szCs w:val="28"/>
+        </w:rPr>
+        <w:t xml:space="preserve">검증에 필요한 자료.</w:t>
+      </w:r>
+      <w:r>
+        <w:rPr>
+          <w:rFonts w:ascii="휴먼명조" w:cs="휴먼명조" w:eastAsia="휴먼명조" w:hAnsi="휴먼명조"/>
+          <w:sz w:val="28"/>
+          <w:szCs w:val="28"/>
+        </w:rPr>
+        <w:t xml:space="preserve"> 설비별 15분 계측(또는 주요 설비 전류), 미룰 수 있는 부하와 허용 지연 시간 목록, 공정 순서·납기 제약, 조치 기록과 조치하지 않은 비교일 기록이 필요하다. 이 자료가 있으면 4.4절의 모의를 설비 단위로 다시 계산하고, 3단계의 효과를 1·2단계와 비교해 확인할 수 있다.</w:t>
+      </w:r>
+    </w:p>
+    <w:p>
+      <w:pPr>
+        <w:pStyle w:val="Heading2"/>
+        <w:keepNext/>
+        <w:spacing w:after="120" w:before="240"/>
+      </w:pPr>
+      <w:r>
+        <w:rPr>
+          <w:rFonts w:ascii="휴먼명조" w:cs="휴먼명조" w:eastAsia="휴먼명조" w:hAnsi="휴먼명조"/>
+          <w:b/>
+          <w:bCs/>
+          <w:sz w:val="30"/>
+          <w:szCs w:val="30"/>
+        </w:rPr>
+        <w:t xml:space="preserve">4.6 현장 적용 지표</w:t>
       </w:r>
     </w:p>
     <w:tbl>
@@ -28040,7 +30397,7 @@
           <w:sz w:val="30"/>
           <w:szCs w:val="30"/>
         </w:rPr>
-        <w:t xml:space="preserve">4.6 소결</w:t>
+        <w:t xml:space="preserve">4.7 소결</w:t>
       </w:r>
     </w:p>
     <w:p>
@@ -28054,7 +30411,7 @@
           <w:sz w:val="28"/>
           <w:szCs w:val="28"/>
         </w:rPr>
-        <w:t xml:space="preserve">제안 모델은 기본요금과 직결되는 일·월 최대 구간을 모두 미리 경보했다. 이 경보로 준비하는 목표 최대수요 운영은 근무일 하루 7.7시간의 준비와 5일 13번의 짧은 부하 지연으로 8월 최대수요를 8.3% 낮추었다. 기동 시점 분산과 경보 시간 생산량 이동은 피크 발생 자체를 줄여 이 운영을 돕는다. 비용-손실 분석은 현장의 비용 구조에 맞는 조치 기준을 제공한다.</w:t>
+        <w:t xml:space="preserve">제안 모델은 기본요금과 직결되는 일·월 최대 구간을 모두 미리 경보했다. 이 경보로 준비하는 목표 최대수요 운영은 근무일 하루 7.7시간의 준비와 5일 13번의 짧은 부하 지연으로 8월 최대수요를 8.3% 낮추었다. 기동 시점 분산과 경보 시간 생산량 이동은 피크 발생 자체를 줄여 이 운영을 돕는다. 비용-손실 분석은 현장의 비용 구조에 맞는 조치 기준을 제공한다. 필요한 조치가 작고 드물며 2시간 이상 앞서 알 수 있으므로, 이 조치를 설비 에이전트가 협상해 실행하는 피지컬 AI 구조로 단계적으로 자동화할 수 있다.</w:t>
       </w:r>
     </w:p>
     <w:p>
@@ -29206,7 +31563,7 @@
           <w:sz w:val="28"/>
           <w:szCs w:val="28"/>
         </w:rPr>
-        <w:t xml:space="preserve"> 피크 확률을 비용-손실 판단에 연결했다. 예측 경보가 준비 시간을 정하고 실시간 계측이 제어량을 정하는 목표 최대수요 운영으로, 예측을 현장 조치에 연결했다.</w:t>
+        <w:t xml:space="preserve"> 피크 확률을 비용-손실 판단에 연결했다. 예측 경보가 준비 시간을 정하고 실시간 계측이 제어량을 정하는 목표 최대수요 운영으로, 예측을 현장 조치에 연결했다. 모의 운영의 조치 빈도·크기·여유 시간으로 피지컬 AI 실행 계층의 요구 사양을 정량화해, 구조 제안이 자료에 근거하도록 했다.</w:t>
       </w:r>
     </w:p>
     <w:p>
@@ -30437,6 +32794,35 @@
     </w:p>
     <w:p>
       <w:pPr>
+        <w:pStyle w:val="ListParagraph"/>
+        <w:numPr>
+          <w:ilvl w:val="0"/>
+          <w:numId w:val="12"/>
+        </w:numPr>
+        <w:spacing w:after="60" w:line="384"/>
+        <w:jc w:val="both"/>
+      </w:pPr>
+      <w:r>
+        <w:rPr>
+          <w:rFonts w:ascii="휴먼명조" w:cs="휴먼명조" w:eastAsia="휴먼명조" w:hAnsi="휴먼명조"/>
+          <w:b/>
+          <w:bCs/>
+          <w:sz w:val="28"/>
+          <w:szCs w:val="28"/>
+        </w:rPr>
+        <w:t xml:space="preserve">실행 구조.</w:t>
+      </w:r>
+      <w:r>
+        <w:rPr>
+          <w:rFonts w:ascii="휴먼명조" w:cs="휴먼명조" w:eastAsia="휴먼명조" w:hAnsi="휴먼명조"/>
+          <w:sz w:val="28"/>
+          <w:szCs w:val="28"/>
+        </w:rPr>
+        <w:t xml:space="preserve"> 필요한 조치는 한 번에 부하의 2.6%, 38일 중 5일로 작고 드물며, 목표를 넘은 구간은 모두 2시간 15분 이상 앞서 경보되었다. 이를 근거로 설비 에이전트가 협상해 실행하는 피지컬 AI 구조와 3단계 도입 경로를 제안했다.</w:t>
+      </w:r>
+    </w:p>
+    <w:p>
+      <w:pPr>
         <w:pStyle w:val="Heading2"/>
         <w:keepNext/>
         <w:spacing w:after="120" w:before="240"/>
@@ -30506,7 +32892,7 @@
           <w:sz w:val="28"/>
           <w:szCs w:val="28"/>
         </w:rPr>
-        <w:t xml:space="preserve">실제 운영 기록으로 목표 최대수요 운영의 효과와 생산량-전력 관계를 다시 추정한다.</w:t>
+        <w:t xml:space="preserve">피지컬 AI 실행 계층을 1단계(운영자 수동 조정)부터 시범 적용하고, 단계마다 월 최대 15분 전력과 제약 위반을 비교한다.</w:t>
       </w:r>
     </w:p>
     <w:p>
@@ -30525,6 +32911,25 @@
           <w:sz w:val="28"/>
           <w:szCs w:val="28"/>
         </w:rPr>
+        <w:t xml:space="preserve">실제 운영 기록으로 목표 최대수요 운영의 효과와 생산량-전력 관계를 다시 추정한다.</w:t>
+      </w:r>
+    </w:p>
+    <w:p>
+      <w:pPr>
+        <w:pStyle w:val="ListParagraph"/>
+        <w:numPr>
+          <w:ilvl w:val="0"/>
+          <w:numId w:val="13"/>
+        </w:numPr>
+        <w:spacing w:after="60" w:line="384"/>
+        <w:jc w:val="both"/>
+      </w:pPr>
+      <w:r>
+        <w:rPr>
+          <w:rFonts w:ascii="휴먼명조" w:cs="휴먼명조" w:eastAsia="휴먼명조" w:hAnsi="휴먼명조"/>
+          <w:sz w:val="28"/>
+          <w:szCs w:val="28"/>
+        </w:rPr>
         <w:t xml:space="preserve">동계 자료를 더해 연간 요금적용전력 기준의 관리로 확장한다.</w:t>
       </w:r>
     </w:p>
@@ -30676,6 +33081,25 @@
           <w:szCs w:val="28"/>
         </w:rPr>
         <w:t xml:space="preserve">Ke, G. et al. (2017). LightGBM: A Highly Efficient Gradient Boosting Decision Tree. Advances in Neural Information Processing Systems 30.</w:t>
+      </w:r>
+    </w:p>
+    <w:p>
+      <w:pPr>
+        <w:pStyle w:val="ListParagraph"/>
+        <w:numPr>
+          <w:ilvl w:val="0"/>
+          <w:numId w:val="14"/>
+        </w:numPr>
+        <w:spacing w:after="60" w:line="384"/>
+        <w:jc w:val="both"/>
+      </w:pPr>
+      <w:r>
+        <w:rPr>
+          <w:rFonts w:ascii="휴먼명조" w:cs="휴먼명조" w:eastAsia="휴먼명조" w:hAnsi="휴먼명조"/>
+          <w:sz w:val="28"/>
+          <w:szCs w:val="28"/>
+        </w:rPr>
+        <w:t xml:space="preserve">Liu, C., Tang, D., Zhu, H., Wang, L., Cai, Q., Nie, Q. (2026). LLM-enhanced embodied multi-agent manufacturing system: A novel self-organizing production paradigm for embodied perception, embodied analysis and embodied decision. Journal of Manufacturing Systems, 84, 357–382.</w:t>
       </w:r>
     </w:p>
     <w:p>

</xml_diff>